<commit_message>
docker - intro file updated
</commit_message>
<xml_diff>
--- a/Docker/1-intro.docx
+++ b/Docker/1-intro.docx
@@ -1556,9 +1556,16 @@
           <w:sz w:val="28"/>
           <w:szCs w:val="28"/>
         </w:rPr>
-        <w:t xml:space="preserve">Processes inside a namespace think they are alone, even when they are </w:t>
-      </w:r>
-      <w:proofErr w:type="spellStart"/>
+        <w:t>Processes inside a namespace think they are alone, even when they are not.</w:t>
+      </w:r>
+      <w:r>
+        <w:rPr>
+          <w:rFonts w:asciiTheme="majorBidi" w:hAnsiTheme="majorBidi" w:cstheme="majorBidi"/>
+          <w:sz w:val="28"/>
+          <w:szCs w:val="28"/>
+        </w:rPr>
+        <w:t xml:space="preserve"> </w:t>
+      </w:r>
       <w:proofErr w:type="gramStart"/>
       <w:r>
         <w:rPr>
@@ -1566,9 +1573,8 @@
           <w:sz w:val="28"/>
           <w:szCs w:val="28"/>
         </w:rPr>
-        <w:t>not.This</w:t>
-      </w:r>
-      <w:proofErr w:type="spellEnd"/>
+        <w:t>This</w:t>
+      </w:r>
       <w:proofErr w:type="gramEnd"/>
       <w:r>
         <w:rPr>
@@ -1634,15 +1640,26 @@
           <w:rFonts w:asciiTheme="majorBidi" w:hAnsiTheme="majorBidi" w:cstheme="majorBidi"/>
           <w:sz w:val="28"/>
           <w:szCs w:val="28"/>
-        </w:rPr>
-      </w:pPr>
-      <w:r>
-        <w:rPr>
-          <w:rFonts w:asciiTheme="majorBidi" w:hAnsiTheme="majorBidi" w:cstheme="majorBidi"/>
-          <w:sz w:val="28"/>
-          <w:szCs w:val="28"/>
+          <w:u w:val="single"/>
+        </w:rPr>
+      </w:pPr>
+      <w:r>
+        <w:rPr>
+          <w:rFonts w:asciiTheme="majorBidi" w:hAnsiTheme="majorBidi" w:cstheme="majorBidi"/>
+          <w:sz w:val="28"/>
+          <w:szCs w:val="28"/>
+          <w:u w:val="single"/>
         </w:rPr>
         <w:t>What Namespaces Isolate</w:t>
+      </w:r>
+      <w:r>
+        <w:rPr>
+          <w:rFonts w:asciiTheme="majorBidi" w:hAnsiTheme="majorBidi" w:cstheme="majorBidi"/>
+          <w:sz w:val="28"/>
+          <w:szCs w:val="28"/>
+          <w:u w:val="single"/>
+        </w:rPr>
+        <w:t>?</w:t>
       </w:r>
     </w:p>
     <w:p>
@@ -11349,39 +11366,7 @@
           <w:sz w:val="28"/>
           <w:szCs w:val="28"/>
         </w:rPr>
-        <w:t xml:space="preserve"> → pull all tags</w:t>
-      </w:r>
-      <w:r>
-        <w:rPr>
-          <w:rFonts w:asciiTheme="majorBidi" w:hAnsiTheme="majorBidi" w:cstheme="majorBidi"/>
-          <w:sz w:val="28"/>
-          <w:szCs w:val="28"/>
-        </w:rPr>
-        <w:t xml:space="preserve">, </w:t>
-      </w:r>
-      <w:r>
-        <w:rPr>
-          <w:rFonts w:asciiTheme="majorBidi" w:hAnsiTheme="majorBidi" w:cstheme="majorBidi"/>
-          <w:sz w:val="28"/>
-          <w:szCs w:val="28"/>
-        </w:rPr>
-        <w:t>Downloads all versions of nginx.</w:t>
-      </w:r>
-      <w:r>
-        <w:rPr>
-          <w:rFonts w:asciiTheme="majorBidi" w:hAnsiTheme="majorBidi" w:cstheme="majorBidi"/>
-          <w:sz w:val="28"/>
-          <w:szCs w:val="28"/>
-        </w:rPr>
-        <w:t xml:space="preserve"> </w:t>
-      </w:r>
-      <w:r>
-        <w:rPr>
-          <w:rFonts w:asciiTheme="majorBidi" w:hAnsiTheme="majorBidi" w:cstheme="majorBidi"/>
-          <w:sz w:val="28"/>
-          <w:szCs w:val="28"/>
-        </w:rPr>
-        <w:t>Without this, only latest is pulled.</w:t>
+        <w:t xml:space="preserve"> → pull all tags, Downloads all versions of nginx. Without this, only latest is pulled.</w:t>
       </w:r>
     </w:p>
     <w:p>
@@ -11416,23 +11401,7 @@
           <w:sz w:val="28"/>
           <w:szCs w:val="28"/>
         </w:rPr>
-        <w:t xml:space="preserve"> → specify architecture</w:t>
-      </w:r>
-      <w:r>
-        <w:rPr>
-          <w:rFonts w:asciiTheme="majorBidi" w:hAnsiTheme="majorBidi" w:cstheme="majorBidi"/>
-          <w:sz w:val="28"/>
-          <w:szCs w:val="28"/>
-        </w:rPr>
-        <w:t xml:space="preserve">. Example: </w:t>
-      </w:r>
-      <w:r>
-        <w:rPr>
-          <w:rFonts w:asciiTheme="majorBidi" w:hAnsiTheme="majorBidi" w:cstheme="majorBidi"/>
-          <w:sz w:val="28"/>
-          <w:szCs w:val="28"/>
-        </w:rPr>
-        <w:t xml:space="preserve">docker pull --platform </w:t>
+        <w:t xml:space="preserve"> → specify architecture. Example: docker pull --platform </w:t>
       </w:r>
       <w:proofErr w:type="spellStart"/>
       <w:r>
@@ -11485,23 +11454,7 @@
           <w:sz w:val="28"/>
           <w:szCs w:val="28"/>
         </w:rPr>
-        <w:t xml:space="preserve"> → suppress output</w:t>
-      </w:r>
-      <w:r>
-        <w:rPr>
-          <w:rFonts w:asciiTheme="majorBidi" w:hAnsiTheme="majorBidi" w:cstheme="majorBidi"/>
-          <w:sz w:val="28"/>
-          <w:szCs w:val="28"/>
-        </w:rPr>
-        <w:t xml:space="preserve">. </w:t>
-      </w:r>
-      <w:r>
-        <w:rPr>
-          <w:rFonts w:asciiTheme="majorBidi" w:hAnsiTheme="majorBidi" w:cstheme="majorBidi"/>
-          <w:sz w:val="28"/>
-          <w:szCs w:val="28"/>
-        </w:rPr>
-        <w:t>Shows only image ID.</w:t>
+        <w:t xml:space="preserve"> → suppress output. Shows only image ID.</w:t>
       </w:r>
     </w:p>
     <w:sectPr>

</xml_diff>

<commit_message>
keverything changed and updated
</commit_message>
<xml_diff>
--- a/Docker/1-intro.docx
+++ b/Docker/1-intro.docx
@@ -1,25 +1,7 @@
 
 <file path=word/document.xml><?xml version="1.0" encoding="utf-8"?>
-<w:document xmlns:wpc="http://schemas.microsoft.com/office/word/2010/wordprocessingCanvas" xmlns:cx="http://schemas.microsoft.com/office/drawing/2014/chartex" xmlns:cx1="http://schemas.microsoft.com/office/drawing/2015/9/8/chartex" xmlns:cx2="http://schemas.microsoft.com/office/drawing/2015/10/21/chartex" xmlns:cx3="http://schemas.microsoft.com/office/drawing/2016/5/9/chartex" xmlns:cx4="http://schemas.microsoft.com/office/drawing/2016/5/10/chartex" xmlns:cx5="http://schemas.microsoft.com/office/drawing/2016/5/11/chartex" xmlns:cx6="http://schemas.microsoft.com/office/drawing/2016/5/12/chartex" xmlns:cx7="http://schemas.microsoft.com/office/drawing/2016/5/13/chartex" xmlns:cx8="http://schemas.microsoft.com/office/drawing/2016/5/14/chartex" xmlns:mc="http://schemas.openxmlformats.org/markup-compatibility/2006" xmlns:aink="http://schemas.microsoft.com/office/drawing/2016/ink" xmlns:am3d="http://schemas.microsoft.com/office/drawing/2017/model3d" xmlns:o="urn:schemas-microsoft-com:office:office" xmlns:oel="http://schemas.microsoft.com/office/2019/extlst" xmlns:r="http://schemas.openxmlformats.org/officeDocument/2006/relationships" xmlns:m="http://schemas.openxmlformats.org/officeDocument/2006/math" xmlns:v="urn:schemas-microsoft-com:vml" xmlns:wp14="http://schemas.microsoft.com/office/word/2010/wordprocessingDrawing" xmlns:wp="http://schemas.openxmlformats.org/drawingml/2006/wordprocessingDrawing" xmlns:w10="urn:schemas-microsoft-com:office:word" xmlns:w="http://schemas.openxmlformats.org/wordprocessingml/2006/main" xmlns:w14="http://schemas.microsoft.com/office/word/2010/wordml" xmlns:w15="http://schemas.microsoft.com/office/word/2012/wordml" xmlns:w16cex="http://schemas.microsoft.com/office/word/2018/wordml/cex" xmlns:w16cid="http://schemas.microsoft.com/office/word/2016/wordml/cid" xmlns:w16="http://schemas.microsoft.com/office/word/2018/wordml" xmlns:w16du="http://schemas.microsoft.com/office/word/2023/wordml/word16du" xmlns:w16sdtdh="http://schemas.microsoft.com/office/word/2020/wordml/sdtdatahash" xmlns:w16sdtfl="http://schemas.microsoft.com/office/word/2024/wordml/sdtformatlock" xmlns:w16se="http://schemas.microsoft.com/office/word/2015/wordml/symex" xmlns:wpg="http://schemas.microsoft.com/office/word/2010/wordprocessingGroup" xmlns:wpi="http://schemas.microsoft.com/office/word/2010/wordprocessingInk" xmlns:wne="http://schemas.microsoft.com/office/word/2006/wordml" xmlns:wps="http://schemas.microsoft.com/office/word/2010/wordprocessingShape" mc:Ignorable="w14 w15 w16se w16cid w16 w16cex w16sdtdh w16sdtfl w16du wp14">
+<w:document xmlns:wpc="http://schemas.microsoft.com/office/word/2010/wordprocessingCanvas" xmlns:cx="http://schemas.microsoft.com/office/drawing/2014/chartex" xmlns:cx1="http://schemas.microsoft.com/office/drawing/2015/9/8/chartex" xmlns:cx2="http://schemas.microsoft.com/office/drawing/2015/10/21/chartex" xmlns:cx3="http://schemas.microsoft.com/office/drawing/2016/5/9/chartex" xmlns:cx4="http://schemas.microsoft.com/office/drawing/2016/5/10/chartex" xmlns:cx5="http://schemas.microsoft.com/office/drawing/2016/5/11/chartex" xmlns:cx6="http://schemas.microsoft.com/office/drawing/2016/5/12/chartex" xmlns:cx7="http://schemas.microsoft.com/office/drawing/2016/5/13/chartex" xmlns:cx8="http://schemas.microsoft.com/office/drawing/2016/5/14/chartex" xmlns:mc="http://schemas.openxmlformats.org/markup-compatibility/2006" xmlns:aink="http://schemas.microsoft.com/office/drawing/2016/ink" xmlns:am3d="http://schemas.microsoft.com/office/drawing/2017/model3d" xmlns:o="urn:schemas-microsoft-com:office:office" xmlns:oel="http://schemas.microsoft.com/office/2019/extlst" xmlns:r="http://schemas.openxmlformats.org/officeDocument/2006/relationships" xmlns:m="http://schemas.openxmlformats.org/officeDocument/2006/math" xmlns:v="urn:schemas-microsoft-com:vml" xmlns:wp14="http://schemas.microsoft.com/office/word/2010/wordprocessingDrawing" xmlns:wp="http://schemas.openxmlformats.org/drawingml/2006/wordprocessingDrawing" xmlns:w10="urn:schemas-microsoft-com:office:word" xmlns:w="http://schemas.openxmlformats.org/wordprocessingml/2006/main" xmlns:w14="http://schemas.microsoft.com/office/word/2010/wordml" xmlns:w15="http://schemas.microsoft.com/office/word/2012/wordml" xmlns:w16cex="http://schemas.microsoft.com/office/word/2018/wordml/cex" xmlns:w16cid="http://schemas.microsoft.com/office/word/2016/wordml/cid" xmlns:w16="http://schemas.microsoft.com/office/word/2018/wordml" xmlns:w16sdtdh="http://schemas.microsoft.com/office/word/2020/wordml/sdtdatahash" xmlns:w16se="http://schemas.microsoft.com/office/word/2015/wordml/symex" xmlns:wpg="http://schemas.microsoft.com/office/word/2010/wordprocessingGroup" xmlns:wpi="http://schemas.microsoft.com/office/word/2010/wordprocessingInk" xmlns:wne="http://schemas.microsoft.com/office/word/2006/wordml" xmlns:wps="http://schemas.microsoft.com/office/word/2010/wordprocessingShape" mc:Ignorable="w14 w15 w16se w16cid w16 w16cex w16sdtdh wp14">
   <w:body>
-    <w:p>
-      <w:pPr>
-        <w:jc w:val="both"/>
-        <w:rPr>
-          <w:rFonts w:ascii="G2 Rubber Stamp LET" w:hAnsi="G2 Rubber Stamp LET"/>
-          <w:sz w:val="56"/>
-          <w:szCs w:val="56"/>
-        </w:rPr>
-      </w:pPr>
-      <w:r>
-        <w:rPr>
-          <w:rFonts w:ascii="G2 Rubber Stamp LET" w:hAnsi="G2 Rubber Stamp LET"/>
-          <w:sz w:val="56"/>
-          <w:szCs w:val="56"/>
-        </w:rPr>
-        <w:t>Introduction</w:t>
-      </w:r>
-    </w:p>
     <w:p>
       <w:pPr>
         <w:jc w:val="both"/>
@@ -191,8 +173,18 @@
           <w:sz w:val="28"/>
           <w:szCs w:val="28"/>
         </w:rPr>
-        <w:t>VMware ESXi</w:t>
-      </w:r>
+        <w:t xml:space="preserve">VMware </w:t>
+      </w:r>
+      <w:proofErr w:type="spellStart"/>
+      <w:r>
+        <w:rPr>
+          <w:rFonts w:asciiTheme="majorBidi" w:hAnsiTheme="majorBidi" w:cstheme="majorBidi"/>
+          <w:sz w:val="28"/>
+          <w:szCs w:val="28"/>
+        </w:rPr>
+        <w:t>ESXi</w:t>
+      </w:r>
+      <w:proofErr w:type="spellEnd"/>
     </w:p>
     <w:p>
       <w:pPr>
@@ -393,7 +385,25 @@
           <w:sz w:val="28"/>
           <w:szCs w:val="28"/>
         </w:rPr>
-        <w:t>its own init system</w:t>
+        <w:t xml:space="preserve">its own </w:t>
+      </w:r>
+      <w:proofErr w:type="spellStart"/>
+      <w:r>
+        <w:rPr>
+          <w:rFonts w:asciiTheme="majorBidi" w:hAnsiTheme="majorBidi" w:cstheme="majorBidi"/>
+          <w:sz w:val="28"/>
+          <w:szCs w:val="28"/>
+        </w:rPr>
+        <w:t>init</w:t>
+      </w:r>
+      <w:proofErr w:type="spellEnd"/>
+      <w:r>
+        <w:rPr>
+          <w:rFonts w:asciiTheme="majorBidi" w:hAnsiTheme="majorBidi" w:cstheme="majorBidi"/>
+          <w:sz w:val="28"/>
+          <w:szCs w:val="28"/>
+        </w:rPr>
+        <w:t xml:space="preserve"> system</w:t>
       </w:r>
     </w:p>
     <w:p>
@@ -429,13 +439,23 @@
           <w:szCs w:val="28"/>
         </w:rPr>
       </w:pPr>
-      <w:r>
-        <w:rPr>
-          <w:rFonts w:asciiTheme="majorBidi" w:hAnsiTheme="majorBidi" w:cstheme="majorBidi"/>
-          <w:sz w:val="28"/>
-          <w:szCs w:val="28"/>
-        </w:rPr>
-        <w:t>So the stack looks like this:</w:t>
+      <w:proofErr w:type="gramStart"/>
+      <w:r>
+        <w:rPr>
+          <w:rFonts w:asciiTheme="majorBidi" w:hAnsiTheme="majorBidi" w:cstheme="majorBidi"/>
+          <w:sz w:val="28"/>
+          <w:szCs w:val="28"/>
+        </w:rPr>
+        <w:t>So</w:t>
+      </w:r>
+      <w:proofErr w:type="gramEnd"/>
+      <w:r>
+        <w:rPr>
+          <w:rFonts w:asciiTheme="majorBidi" w:hAnsiTheme="majorBidi" w:cstheme="majorBidi"/>
+          <w:sz w:val="28"/>
+          <w:szCs w:val="28"/>
+        </w:rPr>
+        <w:t xml:space="preserve"> the stack looks like this:</w:t>
       </w:r>
     </w:p>
     <w:p>
@@ -687,14 +707,23 @@
           <w:szCs w:val="28"/>
         </w:rPr>
       </w:pPr>
-      <w:r>
-        <w:rPr>
-          <w:rFonts w:asciiTheme="majorBidi" w:hAnsiTheme="majorBidi" w:cstheme="majorBidi"/>
-          <w:sz w:val="28"/>
-          <w:szCs w:val="28"/>
-        </w:rPr>
-        <w:lastRenderedPageBreak/>
-        <w:t>cgroups → resource limits (CPU, memory)</w:t>
+      <w:proofErr w:type="spellStart"/>
+      <w:r>
+        <w:rPr>
+          <w:rFonts w:asciiTheme="majorBidi" w:hAnsiTheme="majorBidi" w:cstheme="majorBidi"/>
+          <w:sz w:val="28"/>
+          <w:szCs w:val="28"/>
+        </w:rPr>
+        <w:t>cgroups</w:t>
+      </w:r>
+      <w:proofErr w:type="spellEnd"/>
+      <w:r>
+        <w:rPr>
+          <w:rFonts w:asciiTheme="majorBidi" w:hAnsiTheme="majorBidi" w:cstheme="majorBidi"/>
+          <w:sz w:val="28"/>
+          <w:szCs w:val="28"/>
+        </w:rPr>
+        <w:t xml:space="preserve"> → resource limits (CPU, memory)</w:t>
       </w:r>
     </w:p>
     <w:p>
@@ -808,7 +837,26 @@
           <w:sz w:val="28"/>
           <w:szCs w:val="28"/>
         </w:rPr>
-        <w:t>Container runtime (Docker / containerd)</w:t>
+        <w:lastRenderedPageBreak/>
+        <w:t xml:space="preserve">Container runtime (Docker / </w:t>
+      </w:r>
+      <w:proofErr w:type="spellStart"/>
+      <w:r>
+        <w:rPr>
+          <w:rFonts w:asciiTheme="majorBidi" w:hAnsiTheme="majorBidi" w:cstheme="majorBidi"/>
+          <w:sz w:val="28"/>
+          <w:szCs w:val="28"/>
+        </w:rPr>
+        <w:t>containerd</w:t>
+      </w:r>
+      <w:proofErr w:type="spellEnd"/>
+      <w:r>
+        <w:rPr>
+          <w:rFonts w:asciiTheme="majorBidi" w:hAnsiTheme="majorBidi" w:cstheme="majorBidi"/>
+          <w:sz w:val="28"/>
+          <w:szCs w:val="28"/>
+        </w:rPr>
+        <w:t>)</w:t>
       </w:r>
     </w:p>
     <w:p>
@@ -1340,13 +1388,23 @@
         </w:rPr>
         <w:t xml:space="preserve">s, </w:t>
       </w:r>
-      <w:r>
-        <w:rPr>
-          <w:rFonts w:asciiTheme="majorBidi" w:hAnsiTheme="majorBidi" w:cstheme="majorBidi"/>
-          <w:sz w:val="28"/>
-          <w:szCs w:val="28"/>
-        </w:rPr>
-        <w:t>You must use the same kernel type as host.</w:t>
+      <w:proofErr w:type="gramStart"/>
+      <w:r>
+        <w:rPr>
+          <w:rFonts w:asciiTheme="majorBidi" w:hAnsiTheme="majorBidi" w:cstheme="majorBidi"/>
+          <w:sz w:val="28"/>
+          <w:szCs w:val="28"/>
+        </w:rPr>
+        <w:t>You</w:t>
+      </w:r>
+      <w:proofErr w:type="gramEnd"/>
+      <w:r>
+        <w:rPr>
+          <w:rFonts w:asciiTheme="majorBidi" w:hAnsiTheme="majorBidi" w:cstheme="majorBidi"/>
+          <w:sz w:val="28"/>
+          <w:szCs w:val="28"/>
+        </w:rPr>
+        <w:t xml:space="preserve"> must use the same kernel type as host.</w:t>
       </w:r>
       <w:r>
         <w:rPr>
@@ -1619,7 +1677,6 @@
           <w:sz w:val="32"/>
           <w:szCs w:val="32"/>
         </w:rPr>
-        <w:lastRenderedPageBreak/>
         <w:t>PID Namespace - Process isolation</w:t>
       </w:r>
     </w:p>
@@ -1665,6 +1722,7 @@
         </w:rPr>
         <w:t xml:space="preserve">, if you run </w:t>
       </w:r>
+      <w:proofErr w:type="spellStart"/>
       <w:r>
         <w:rPr>
           <w:rFonts w:asciiTheme="majorBidi" w:hAnsiTheme="majorBidi" w:cstheme="majorBidi"/>
@@ -1675,7 +1733,20 @@
           <w:sz w:val="28"/>
           <w:szCs w:val="28"/>
         </w:rPr>
-        <w:t>ps aux</w:t>
+        <w:t>ps</w:t>
+      </w:r>
+      <w:proofErr w:type="spellEnd"/>
+      <w:r>
+        <w:rPr>
+          <w:rFonts w:asciiTheme="majorBidi" w:hAnsiTheme="majorBidi" w:cstheme="majorBidi"/>
+          <w:b/>
+          <w:bCs/>
+          <w:i/>
+          <w:iCs/>
+          <w:sz w:val="28"/>
+          <w:szCs w:val="28"/>
+        </w:rPr>
+        <w:t xml:space="preserve"> aux</w:t>
       </w:r>
       <w:r>
         <w:rPr>
@@ -1685,13 +1756,23 @@
         </w:rPr>
         <w:t xml:space="preserve">, </w:t>
       </w:r>
-      <w:r>
-        <w:rPr>
-          <w:rFonts w:asciiTheme="majorBidi" w:hAnsiTheme="majorBidi" w:cstheme="majorBidi"/>
-          <w:sz w:val="28"/>
-          <w:szCs w:val="28"/>
-        </w:rPr>
-        <w:t>You might see:</w:t>
+      <w:proofErr w:type="gramStart"/>
+      <w:r>
+        <w:rPr>
+          <w:rFonts w:asciiTheme="majorBidi" w:hAnsiTheme="majorBidi" w:cstheme="majorBidi"/>
+          <w:sz w:val="28"/>
+          <w:szCs w:val="28"/>
+        </w:rPr>
+        <w:t>You</w:t>
+      </w:r>
+      <w:proofErr w:type="gramEnd"/>
+      <w:r>
+        <w:rPr>
+          <w:rFonts w:asciiTheme="majorBidi" w:hAnsiTheme="majorBidi" w:cstheme="majorBidi"/>
+          <w:sz w:val="28"/>
+          <w:szCs w:val="28"/>
+        </w:rPr>
+        <w:t xml:space="preserve"> might see:</w:t>
       </w:r>
     </w:p>
     <w:p>
@@ -1808,8 +1889,18 @@
                                 <w:sz w:val="28"/>
                                 <w:szCs w:val="28"/>
                               </w:rPr>
-                              <w:t>PID 12  worker</w:t>
+                              <w:t xml:space="preserve">PID </w:t>
                             </w:r>
+                            <w:proofErr w:type="gramStart"/>
+                            <w:r>
+                              <w:rPr>
+                                <w:rFonts w:asciiTheme="majorBidi" w:hAnsiTheme="majorBidi" w:cstheme="majorBidi"/>
+                                <w:sz w:val="28"/>
+                                <w:szCs w:val="28"/>
+                              </w:rPr>
+                              <w:t>12  worker</w:t>
+                            </w:r>
+                            <w:proofErr w:type="gramEnd"/>
                           </w:p>
                           <w:p>
                             <w:pPr>
@@ -1891,8 +1982,18 @@
                           <w:sz w:val="28"/>
                           <w:szCs w:val="28"/>
                         </w:rPr>
-                        <w:t>PID 12  worker</w:t>
+                        <w:t xml:space="preserve">PID </w:t>
                       </w:r>
+                      <w:proofErr w:type="gramStart"/>
+                      <w:r>
+                        <w:rPr>
+                          <w:rFonts w:asciiTheme="majorBidi" w:hAnsiTheme="majorBidi" w:cstheme="majorBidi"/>
+                          <w:sz w:val="28"/>
+                          <w:szCs w:val="28"/>
+                        </w:rPr>
+                        <w:t>12  worker</w:t>
+                      </w:r>
+                      <w:proofErr w:type="gramEnd"/>
                     </w:p>
                     <w:p>
                       <w:pPr>
@@ -1965,6 +2066,7 @@
           <w:sz w:val="28"/>
           <w:szCs w:val="28"/>
         </w:rPr>
+        <w:lastRenderedPageBreak/>
         <mc:AlternateContent>
           <mc:Choice Requires="wps">
             <w:drawing>
@@ -2191,7 +2293,25 @@
           <w:sz w:val="28"/>
           <w:szCs w:val="28"/>
         </w:rPr>
-        <w:t>It is the init process</w:t>
+        <w:t xml:space="preserve">It is the </w:t>
+      </w:r>
+      <w:proofErr w:type="spellStart"/>
+      <w:r>
+        <w:rPr>
+          <w:rFonts w:asciiTheme="majorBidi" w:hAnsiTheme="majorBidi" w:cstheme="majorBidi"/>
+          <w:sz w:val="28"/>
+          <w:szCs w:val="28"/>
+        </w:rPr>
+        <w:t>init</w:t>
+      </w:r>
+      <w:proofErr w:type="spellEnd"/>
+      <w:r>
+        <w:rPr>
+          <w:rFonts w:asciiTheme="majorBidi" w:hAnsiTheme="majorBidi" w:cstheme="majorBidi"/>
+          <w:sz w:val="28"/>
+          <w:szCs w:val="28"/>
+        </w:rPr>
+        <w:t xml:space="preserve"> process</w:t>
       </w:r>
     </w:p>
     <w:p>
@@ -2472,6 +2592,7 @@
         </w:rPr>
         <w:t xml:space="preserve">, if you run </w:t>
       </w:r>
+      <w:proofErr w:type="spellStart"/>
       <w:r>
         <w:rPr>
           <w:rFonts w:asciiTheme="majorBidi" w:hAnsiTheme="majorBidi" w:cstheme="majorBidi"/>
@@ -2482,8 +2603,35 @@
           <w:sz w:val="28"/>
           <w:szCs w:val="28"/>
         </w:rPr>
-        <w:t>ip addr</w:t>
-      </w:r>
+        <w:t>ip</w:t>
+      </w:r>
+      <w:proofErr w:type="spellEnd"/>
+      <w:r>
+        <w:rPr>
+          <w:rFonts w:asciiTheme="majorBidi" w:hAnsiTheme="majorBidi" w:cstheme="majorBidi"/>
+          <w:b/>
+          <w:bCs/>
+          <w:i/>
+          <w:iCs/>
+          <w:sz w:val="28"/>
+          <w:szCs w:val="28"/>
+        </w:rPr>
+        <w:t xml:space="preserve"> </w:t>
+      </w:r>
+      <w:proofErr w:type="spellStart"/>
+      <w:r>
+        <w:rPr>
+          <w:rFonts w:asciiTheme="majorBidi" w:hAnsiTheme="majorBidi" w:cstheme="majorBidi"/>
+          <w:b/>
+          <w:bCs/>
+          <w:i/>
+          <w:iCs/>
+          <w:sz w:val="28"/>
+          <w:szCs w:val="28"/>
+        </w:rPr>
+        <w:t>addr</w:t>
+      </w:r>
+      <w:proofErr w:type="spellEnd"/>
       <w:r>
         <w:rPr>
           <w:rFonts w:asciiTheme="majorBidi" w:hAnsiTheme="majorBidi" w:cstheme="majorBidi"/>
@@ -2492,13 +2640,23 @@
         </w:rPr>
         <w:t xml:space="preserve">, </w:t>
       </w:r>
-      <w:r>
-        <w:rPr>
-          <w:rFonts w:asciiTheme="majorBidi" w:hAnsiTheme="majorBidi" w:cstheme="majorBidi"/>
-          <w:sz w:val="28"/>
-          <w:szCs w:val="28"/>
-        </w:rPr>
-        <w:t>You see:</w:t>
+      <w:proofErr w:type="gramStart"/>
+      <w:r>
+        <w:rPr>
+          <w:rFonts w:asciiTheme="majorBidi" w:hAnsiTheme="majorBidi" w:cstheme="majorBidi"/>
+          <w:sz w:val="28"/>
+          <w:szCs w:val="28"/>
+        </w:rPr>
+        <w:t>You</w:t>
+      </w:r>
+      <w:proofErr w:type="gramEnd"/>
+      <w:r>
+        <w:rPr>
+          <w:rFonts w:asciiTheme="majorBidi" w:hAnsiTheme="majorBidi" w:cstheme="majorBidi"/>
+          <w:sz w:val="28"/>
+          <w:szCs w:val="28"/>
+        </w:rPr>
+        <w:t xml:space="preserve"> see:</w:t>
       </w:r>
     </w:p>
     <w:p>
@@ -2918,7 +3076,6 @@
           <w:sz w:val="32"/>
           <w:szCs w:val="32"/>
         </w:rPr>
-        <w:lastRenderedPageBreak/>
         <w:t xml:space="preserve">UTS Namespace </w:t>
       </w:r>
       <w:r>
@@ -3225,6 +3382,7 @@
           <w:sz w:val="32"/>
           <w:szCs w:val="32"/>
         </w:rPr>
+        <w:lastRenderedPageBreak/>
         <w:t xml:space="preserve">USER Namespace </w:t>
       </w:r>
       <w:r>
@@ -3401,197 +3559,10 @@
           <w:sz w:val="28"/>
           <w:szCs w:val="28"/>
         </w:rPr>
-        <w:t>/etc/passwd</w:t>
-      </w:r>
-      <w:r>
-        <w:rPr>
-          <w:rFonts w:asciiTheme="majorBidi" w:hAnsiTheme="majorBidi" w:cstheme="majorBidi"/>
-          <w:sz w:val="28"/>
-          <w:szCs w:val="28"/>
-        </w:rPr>
-        <w:t>.</w:t>
-      </w:r>
-      <w:r>
-        <w:rPr>
-          <w:rFonts w:asciiTheme="majorBidi" w:hAnsiTheme="majorBidi" w:cstheme="majorBidi"/>
-          <w:sz w:val="28"/>
-          <w:szCs w:val="28"/>
-        </w:rPr>
-        <w:t xml:space="preserve"> </w:t>
-      </w:r>
-      <w:r>
-        <w:rPr>
-          <w:rFonts w:asciiTheme="majorBidi" w:hAnsiTheme="majorBidi" w:cstheme="majorBidi"/>
-          <w:sz w:val="28"/>
-          <w:szCs w:val="28"/>
-        </w:rPr>
-        <w:t>The kernel only sees numbers.</w:t>
-      </w:r>
-    </w:p>
-    <w:p>
-      <w:pPr>
-        <w:ind w:left="360"/>
-        <w:jc w:val="both"/>
-        <w:rPr>
-          <w:rFonts w:asciiTheme="majorBidi" w:hAnsiTheme="majorBidi" w:cstheme="majorBidi"/>
-          <w:b/>
-          <w:bCs/>
-          <w:sz w:val="28"/>
-          <w:szCs w:val="28"/>
-        </w:rPr>
-      </w:pPr>
-      <w:r>
-        <w:rPr>
-          <w:rFonts w:asciiTheme="majorBidi" w:hAnsiTheme="majorBidi" w:cstheme="majorBidi"/>
-          <w:b/>
-          <w:bCs/>
-          <w:sz w:val="28"/>
-          <w:szCs w:val="28"/>
-        </w:rPr>
-        <w:t>What happens in Docker by default:</w:t>
-      </w:r>
-    </w:p>
-    <w:p>
-      <w:pPr>
-        <w:ind w:left="360"/>
-        <w:jc w:val="both"/>
-        <w:rPr>
-          <w:rFonts w:asciiTheme="majorBidi" w:hAnsiTheme="majorBidi" w:cstheme="majorBidi"/>
-          <w:sz w:val="28"/>
-          <w:szCs w:val="28"/>
-        </w:rPr>
-      </w:pPr>
-      <w:r>
-        <w:rPr>
-          <w:rFonts w:asciiTheme="majorBidi" w:hAnsiTheme="majorBidi" w:cstheme="majorBidi"/>
-          <w:sz w:val="28"/>
-          <w:szCs w:val="28"/>
-        </w:rPr>
-        <w:t>By default, Docker does NOT use user namespaces.</w:t>
-      </w:r>
-      <w:r>
-        <w:rPr>
-          <w:rFonts w:asciiTheme="majorBidi" w:hAnsiTheme="majorBidi" w:cstheme="majorBidi"/>
-          <w:sz w:val="28"/>
-          <w:szCs w:val="28"/>
-        </w:rPr>
-        <w:t xml:space="preserve"> </w:t>
-      </w:r>
-      <w:r>
-        <w:rPr>
-          <w:rFonts w:asciiTheme="majorBidi" w:hAnsiTheme="majorBidi" w:cstheme="majorBidi"/>
-          <w:sz w:val="28"/>
-          <w:szCs w:val="28"/>
-        </w:rPr>
-        <w:t>This means:</w:t>
-      </w:r>
-      <w:r>
-        <w:rPr>
-          <w:rFonts w:asciiTheme="majorBidi" w:hAnsiTheme="majorBidi" w:cstheme="majorBidi"/>
-          <w:sz w:val="28"/>
-          <w:szCs w:val="28"/>
-        </w:rPr>
-        <w:t xml:space="preserve"> c</w:t>
-      </w:r>
-      <w:r>
-        <w:rPr>
-          <w:rFonts w:asciiTheme="majorBidi" w:hAnsiTheme="majorBidi" w:cstheme="majorBidi"/>
-          <w:sz w:val="28"/>
-          <w:szCs w:val="28"/>
-        </w:rPr>
-        <w:t>ontainer UID 0 = Host UID 0</w:t>
-      </w:r>
-    </w:p>
-    <w:p>
-      <w:pPr>
-        <w:ind w:left="360"/>
-        <w:jc w:val="both"/>
-        <w:rPr>
-          <w:rFonts w:asciiTheme="majorBidi" w:hAnsiTheme="majorBidi" w:cstheme="majorBidi"/>
-          <w:sz w:val="28"/>
-          <w:szCs w:val="28"/>
-        </w:rPr>
-      </w:pPr>
-      <w:r>
-        <w:rPr>
-          <w:rFonts w:asciiTheme="majorBidi" w:hAnsiTheme="majorBidi" w:cstheme="majorBidi"/>
-          <w:sz w:val="28"/>
-          <w:szCs w:val="28"/>
-        </w:rPr>
-        <w:t>Container UID 1000 = Host UID 1000</w:t>
-      </w:r>
-      <w:r>
-        <w:rPr>
-          <w:rFonts w:asciiTheme="majorBidi" w:hAnsiTheme="majorBidi" w:cstheme="majorBidi"/>
-          <w:sz w:val="28"/>
-          <w:szCs w:val="28"/>
-        </w:rPr>
-        <w:t xml:space="preserve"> </w:t>
-      </w:r>
-      <w:r>
-        <w:rPr>
-          <w:rFonts w:asciiTheme="majorBidi" w:hAnsiTheme="majorBidi" w:cstheme="majorBidi"/>
-          <w:sz w:val="28"/>
-          <w:szCs w:val="28"/>
-        </w:rPr>
-        <w:t>→</w:t>
-      </w:r>
-      <w:r>
-        <w:rPr>
-          <w:rFonts w:asciiTheme="majorBidi" w:hAnsiTheme="majorBidi" w:cstheme="majorBidi"/>
-          <w:sz w:val="28"/>
-          <w:szCs w:val="28"/>
-        </w:rPr>
-        <w:t xml:space="preserve"> </w:t>
-      </w:r>
-      <w:r>
-        <w:rPr>
-          <w:rFonts w:asciiTheme="majorBidi" w:hAnsiTheme="majorBidi" w:cstheme="majorBidi"/>
-          <w:sz w:val="28"/>
-          <w:szCs w:val="28"/>
-        </w:rPr>
-        <w:t>They are the same.</w:t>
-      </w:r>
-      <w:r>
-        <w:rPr>
-          <w:rFonts w:asciiTheme="majorBidi" w:hAnsiTheme="majorBidi" w:cstheme="majorBidi"/>
-          <w:sz w:val="28"/>
-          <w:szCs w:val="28"/>
-        </w:rPr>
-        <w:t xml:space="preserve"> </w:t>
-      </w:r>
-      <w:r>
-        <w:rPr>
-          <w:rFonts w:asciiTheme="majorBidi" w:hAnsiTheme="majorBidi" w:cstheme="majorBidi"/>
-          <w:sz w:val="28"/>
-          <w:szCs w:val="28"/>
-        </w:rPr>
-        <w:t>Example:</w:t>
-      </w:r>
-    </w:p>
-    <w:p>
-      <w:pPr>
-        <w:ind w:left="360"/>
-        <w:jc w:val="both"/>
-        <w:rPr>
-          <w:rFonts w:asciiTheme="majorBidi" w:hAnsiTheme="majorBidi" w:cstheme="majorBidi"/>
-          <w:sz w:val="28"/>
-          <w:szCs w:val="28"/>
-        </w:rPr>
-      </w:pPr>
-      <w:r>
-        <w:rPr>
-          <w:rFonts w:asciiTheme="majorBidi" w:hAnsiTheme="majorBidi" w:cstheme="majorBidi"/>
-          <w:sz w:val="28"/>
-          <w:szCs w:val="28"/>
-        </w:rPr>
-        <w:t>Inside container:</w:t>
-      </w:r>
-    </w:p>
-    <w:p>
-      <w:pPr>
-        <w:ind w:left="360"/>
-        <w:jc w:val="both"/>
+        <w:t>/</w:t>
+      </w:r>
+      <w:proofErr w:type="spellStart"/>
+      <w:r>
         <w:rPr>
           <w:rFonts w:asciiTheme="majorBidi" w:hAnsiTheme="majorBidi" w:cstheme="majorBidi"/>
           <w:b/>
@@ -3601,7 +3572,9 @@
           <w:sz w:val="28"/>
           <w:szCs w:val="28"/>
         </w:rPr>
-      </w:pPr>
+        <w:t>etc</w:t>
+      </w:r>
+      <w:proofErr w:type="spellEnd"/>
       <w:r>
         <w:rPr>
           <w:rFonts w:asciiTheme="majorBidi" w:hAnsiTheme="majorBidi" w:cstheme="majorBidi"/>
@@ -3612,9 +3585,197 @@
           <w:sz w:val="28"/>
           <w:szCs w:val="28"/>
         </w:rPr>
-        <w:t>id</w:t>
-      </w:r>
-      <w:r>
+        <w:t>/passwd</w:t>
+      </w:r>
+      <w:r>
+        <w:rPr>
+          <w:rFonts w:asciiTheme="majorBidi" w:hAnsiTheme="majorBidi" w:cstheme="majorBidi"/>
+          <w:sz w:val="28"/>
+          <w:szCs w:val="28"/>
+        </w:rPr>
+        <w:t>.</w:t>
+      </w:r>
+      <w:r>
+        <w:rPr>
+          <w:rFonts w:asciiTheme="majorBidi" w:hAnsiTheme="majorBidi" w:cstheme="majorBidi"/>
+          <w:sz w:val="28"/>
+          <w:szCs w:val="28"/>
+        </w:rPr>
+        <w:t xml:space="preserve"> </w:t>
+      </w:r>
+      <w:r>
+        <w:rPr>
+          <w:rFonts w:asciiTheme="majorBidi" w:hAnsiTheme="majorBidi" w:cstheme="majorBidi"/>
+          <w:sz w:val="28"/>
+          <w:szCs w:val="28"/>
+        </w:rPr>
+        <w:t>The kernel only sees numbers.</w:t>
+      </w:r>
+    </w:p>
+    <w:p>
+      <w:pPr>
+        <w:ind w:left="360"/>
+        <w:jc w:val="both"/>
+        <w:rPr>
+          <w:rFonts w:asciiTheme="majorBidi" w:hAnsiTheme="majorBidi" w:cstheme="majorBidi"/>
+          <w:b/>
+          <w:bCs/>
+          <w:sz w:val="28"/>
+          <w:szCs w:val="28"/>
+        </w:rPr>
+      </w:pPr>
+      <w:r>
+        <w:rPr>
+          <w:rFonts w:asciiTheme="majorBidi" w:hAnsiTheme="majorBidi" w:cstheme="majorBidi"/>
+          <w:b/>
+          <w:bCs/>
+          <w:sz w:val="28"/>
+          <w:szCs w:val="28"/>
+        </w:rPr>
+        <w:t>What happens in Docker by default:</w:t>
+      </w:r>
+    </w:p>
+    <w:p>
+      <w:pPr>
+        <w:ind w:left="360"/>
+        <w:jc w:val="both"/>
+        <w:rPr>
+          <w:rFonts w:asciiTheme="majorBidi" w:hAnsiTheme="majorBidi" w:cstheme="majorBidi"/>
+          <w:sz w:val="28"/>
+          <w:szCs w:val="28"/>
+        </w:rPr>
+      </w:pPr>
+      <w:r>
+        <w:rPr>
+          <w:rFonts w:asciiTheme="majorBidi" w:hAnsiTheme="majorBidi" w:cstheme="majorBidi"/>
+          <w:sz w:val="28"/>
+          <w:szCs w:val="28"/>
+        </w:rPr>
+        <w:t>By default, Docker does NOT use user namespaces.</w:t>
+      </w:r>
+      <w:r>
+        <w:rPr>
+          <w:rFonts w:asciiTheme="majorBidi" w:hAnsiTheme="majorBidi" w:cstheme="majorBidi"/>
+          <w:sz w:val="28"/>
+          <w:szCs w:val="28"/>
+        </w:rPr>
+        <w:t xml:space="preserve"> </w:t>
+      </w:r>
+      <w:r>
+        <w:rPr>
+          <w:rFonts w:asciiTheme="majorBidi" w:hAnsiTheme="majorBidi" w:cstheme="majorBidi"/>
+          <w:sz w:val="28"/>
+          <w:szCs w:val="28"/>
+        </w:rPr>
+        <w:t>This means:</w:t>
+      </w:r>
+      <w:r>
+        <w:rPr>
+          <w:rFonts w:asciiTheme="majorBidi" w:hAnsiTheme="majorBidi" w:cstheme="majorBidi"/>
+          <w:sz w:val="28"/>
+          <w:szCs w:val="28"/>
+        </w:rPr>
+        <w:t xml:space="preserve"> c</w:t>
+      </w:r>
+      <w:r>
+        <w:rPr>
+          <w:rFonts w:asciiTheme="majorBidi" w:hAnsiTheme="majorBidi" w:cstheme="majorBidi"/>
+          <w:sz w:val="28"/>
+          <w:szCs w:val="28"/>
+        </w:rPr>
+        <w:t>ontainer UID 0 = Host UID 0</w:t>
+      </w:r>
+    </w:p>
+    <w:p>
+      <w:pPr>
+        <w:ind w:left="360"/>
+        <w:jc w:val="both"/>
+        <w:rPr>
+          <w:rFonts w:asciiTheme="majorBidi" w:hAnsiTheme="majorBidi" w:cstheme="majorBidi"/>
+          <w:sz w:val="28"/>
+          <w:szCs w:val="28"/>
+        </w:rPr>
+      </w:pPr>
+      <w:r>
+        <w:rPr>
+          <w:rFonts w:asciiTheme="majorBidi" w:hAnsiTheme="majorBidi" w:cstheme="majorBidi"/>
+          <w:sz w:val="28"/>
+          <w:szCs w:val="28"/>
+        </w:rPr>
+        <w:t>Container UID 1000 = Host UID 1000</w:t>
+      </w:r>
+      <w:r>
+        <w:rPr>
+          <w:rFonts w:asciiTheme="majorBidi" w:hAnsiTheme="majorBidi" w:cstheme="majorBidi"/>
+          <w:sz w:val="28"/>
+          <w:szCs w:val="28"/>
+        </w:rPr>
+        <w:t xml:space="preserve"> </w:t>
+      </w:r>
+      <w:r>
+        <w:rPr>
+          <w:rFonts w:asciiTheme="majorBidi" w:hAnsiTheme="majorBidi" w:cstheme="majorBidi"/>
+          <w:sz w:val="28"/>
+          <w:szCs w:val="28"/>
+        </w:rPr>
+        <w:t>→</w:t>
+      </w:r>
+      <w:r>
+        <w:rPr>
+          <w:rFonts w:asciiTheme="majorBidi" w:hAnsiTheme="majorBidi" w:cstheme="majorBidi"/>
+          <w:sz w:val="28"/>
+          <w:szCs w:val="28"/>
+        </w:rPr>
+        <w:t xml:space="preserve"> </w:t>
+      </w:r>
+      <w:r>
+        <w:rPr>
+          <w:rFonts w:asciiTheme="majorBidi" w:hAnsiTheme="majorBidi" w:cstheme="majorBidi"/>
+          <w:sz w:val="28"/>
+          <w:szCs w:val="28"/>
+        </w:rPr>
+        <w:t>They are the same.</w:t>
+      </w:r>
+      <w:r>
+        <w:rPr>
+          <w:rFonts w:asciiTheme="majorBidi" w:hAnsiTheme="majorBidi" w:cstheme="majorBidi"/>
+          <w:sz w:val="28"/>
+          <w:szCs w:val="28"/>
+        </w:rPr>
+        <w:t xml:space="preserve"> </w:t>
+      </w:r>
+      <w:r>
+        <w:rPr>
+          <w:rFonts w:asciiTheme="majorBidi" w:hAnsiTheme="majorBidi" w:cstheme="majorBidi"/>
+          <w:sz w:val="28"/>
+          <w:szCs w:val="28"/>
+        </w:rPr>
+        <w:t>Example:</w:t>
+      </w:r>
+    </w:p>
+    <w:p>
+      <w:pPr>
+        <w:ind w:left="360"/>
+        <w:jc w:val="both"/>
+        <w:rPr>
+          <w:rFonts w:asciiTheme="majorBidi" w:hAnsiTheme="majorBidi" w:cstheme="majorBidi"/>
+          <w:sz w:val="28"/>
+          <w:szCs w:val="28"/>
+        </w:rPr>
+      </w:pPr>
+      <w:r>
+        <w:rPr>
+          <w:rFonts w:asciiTheme="majorBidi" w:hAnsiTheme="majorBidi" w:cstheme="majorBidi"/>
+          <w:sz w:val="28"/>
+          <w:szCs w:val="28"/>
+        </w:rPr>
+        <w:t>Inside container:</w:t>
+      </w:r>
+    </w:p>
+    <w:p>
+      <w:pPr>
+        <w:ind w:left="360"/>
+        <w:jc w:val="both"/>
         <w:rPr>
           <w:rFonts w:asciiTheme="majorBidi" w:hAnsiTheme="majorBidi" w:cstheme="majorBidi"/>
           <w:b/>
@@ -3624,32 +3785,7 @@
           <w:sz w:val="28"/>
           <w:szCs w:val="28"/>
         </w:rPr>
-        <w:t xml:space="preserve"> </w:t>
-      </w:r>
-      <w:r>
-        <w:rPr>
-          <w:rFonts w:asciiTheme="majorBidi" w:hAnsiTheme="majorBidi" w:cstheme="majorBidi"/>
-          <w:sz w:val="28"/>
-          <w:szCs w:val="28"/>
-        </w:rPr>
-        <w:t>→</w:t>
-      </w:r>
-      <w:r>
-        <w:rPr>
-          <w:rFonts w:asciiTheme="majorBidi" w:hAnsiTheme="majorBidi" w:cstheme="majorBidi"/>
-          <w:sz w:val="28"/>
-          <w:szCs w:val="28"/>
-        </w:rPr>
-        <w:t xml:space="preserve"> </w:t>
-      </w:r>
-      <w:r>
-        <w:rPr>
-          <w:rFonts w:asciiTheme="majorBidi" w:hAnsiTheme="majorBidi" w:cstheme="majorBidi"/>
-          <w:sz w:val="28"/>
-          <w:szCs w:val="28"/>
-        </w:rPr>
-        <w:t>Output:</w:t>
-      </w:r>
+      </w:pPr>
       <w:r>
         <w:rPr>
           <w:rFonts w:asciiTheme="majorBidi" w:hAnsiTheme="majorBidi" w:cstheme="majorBidi"/>
@@ -3660,7 +3796,7 @@
           <w:sz w:val="28"/>
           <w:szCs w:val="28"/>
         </w:rPr>
-        <w:t xml:space="preserve"> </w:t>
+        <w:t>id</w:t>
       </w:r>
       <w:r>
         <w:rPr>
@@ -3672,32 +3808,33 @@
           <w:sz w:val="28"/>
           <w:szCs w:val="28"/>
         </w:rPr>
-        <w:t>uid=0(root) gid=0(root)</w:t>
-      </w:r>
-    </w:p>
-    <w:p>
-      <w:pPr>
-        <w:ind w:left="360"/>
-        <w:jc w:val="both"/>
-        <w:rPr>
-          <w:rFonts w:asciiTheme="majorBidi" w:hAnsiTheme="majorBidi" w:cstheme="majorBidi"/>
-          <w:sz w:val="28"/>
-          <w:szCs w:val="28"/>
-        </w:rPr>
-      </w:pPr>
-      <w:r>
-        <w:rPr>
-          <w:rFonts w:asciiTheme="majorBidi" w:hAnsiTheme="majorBidi" w:cstheme="majorBidi"/>
-          <w:sz w:val="28"/>
-          <w:szCs w:val="28"/>
-        </w:rPr>
-        <w:t>On host, check process:</w:t>
-      </w:r>
-    </w:p>
-    <w:p>
-      <w:pPr>
-        <w:ind w:left="360"/>
-        <w:jc w:val="both"/>
+        <w:t xml:space="preserve"> </w:t>
+      </w:r>
+      <w:r>
+        <w:rPr>
+          <w:rFonts w:asciiTheme="majorBidi" w:hAnsiTheme="majorBidi" w:cstheme="majorBidi"/>
+          <w:sz w:val="28"/>
+          <w:szCs w:val="28"/>
+        </w:rPr>
+        <w:t>→</w:t>
+      </w:r>
+      <w:r>
+        <w:rPr>
+          <w:rFonts w:asciiTheme="majorBidi" w:hAnsiTheme="majorBidi" w:cstheme="majorBidi"/>
+          <w:sz w:val="28"/>
+          <w:szCs w:val="28"/>
+        </w:rPr>
+        <w:t xml:space="preserve"> </w:t>
+      </w:r>
+      <w:r>
+        <w:rPr>
+          <w:rFonts w:asciiTheme="majorBidi" w:hAnsiTheme="majorBidi" w:cstheme="majorBidi"/>
+          <w:sz w:val="28"/>
+          <w:szCs w:val="28"/>
+        </w:rPr>
+        <w:t>Output:</w:t>
+      </w:r>
+      <w:r>
         <w:rPr>
           <w:rFonts w:asciiTheme="majorBidi" w:hAnsiTheme="majorBidi" w:cstheme="majorBidi"/>
           <w:b/>
@@ -3707,7 +3844,9 @@
           <w:sz w:val="28"/>
           <w:szCs w:val="28"/>
         </w:rPr>
-      </w:pPr>
+        <w:t xml:space="preserve"> </w:t>
+      </w:r>
+      <w:proofErr w:type="spellStart"/>
       <w:r>
         <w:rPr>
           <w:rFonts w:asciiTheme="majorBidi" w:hAnsiTheme="majorBidi" w:cstheme="majorBidi"/>
@@ -3718,7 +3857,80 @@
           <w:sz w:val="28"/>
           <w:szCs w:val="28"/>
         </w:rPr>
-        <w:t>ps aux | grep nginx</w:t>
+        <w:t>uid</w:t>
+      </w:r>
+      <w:proofErr w:type="spellEnd"/>
+      <w:r>
+        <w:rPr>
+          <w:rFonts w:asciiTheme="majorBidi" w:hAnsiTheme="majorBidi" w:cstheme="majorBidi"/>
+          <w:b/>
+          <w:bCs/>
+          <w:i/>
+          <w:iCs/>
+          <w:sz w:val="28"/>
+          <w:szCs w:val="28"/>
+        </w:rPr>
+        <w:t>=0(root) gid=0(root)</w:t>
+      </w:r>
+    </w:p>
+    <w:p>
+      <w:pPr>
+        <w:ind w:left="360"/>
+        <w:jc w:val="both"/>
+        <w:rPr>
+          <w:rFonts w:asciiTheme="majorBidi" w:hAnsiTheme="majorBidi" w:cstheme="majorBidi"/>
+          <w:sz w:val="28"/>
+          <w:szCs w:val="28"/>
+        </w:rPr>
+      </w:pPr>
+      <w:r>
+        <w:rPr>
+          <w:rFonts w:asciiTheme="majorBidi" w:hAnsiTheme="majorBidi" w:cstheme="majorBidi"/>
+          <w:sz w:val="28"/>
+          <w:szCs w:val="28"/>
+        </w:rPr>
+        <w:t>On host, check process:</w:t>
+      </w:r>
+    </w:p>
+    <w:p>
+      <w:pPr>
+        <w:ind w:left="360"/>
+        <w:jc w:val="both"/>
+        <w:rPr>
+          <w:rFonts w:asciiTheme="majorBidi" w:hAnsiTheme="majorBidi" w:cstheme="majorBidi"/>
+          <w:b/>
+          <w:bCs/>
+          <w:i/>
+          <w:iCs/>
+          <w:sz w:val="28"/>
+          <w:szCs w:val="28"/>
+        </w:rPr>
+      </w:pPr>
+      <w:proofErr w:type="spellStart"/>
+      <w:r>
+        <w:rPr>
+          <w:rFonts w:asciiTheme="majorBidi" w:hAnsiTheme="majorBidi" w:cstheme="majorBidi"/>
+          <w:b/>
+          <w:bCs/>
+          <w:i/>
+          <w:iCs/>
+          <w:sz w:val="28"/>
+          <w:szCs w:val="28"/>
+        </w:rPr>
+        <w:t>ps</w:t>
+      </w:r>
+      <w:proofErr w:type="spellEnd"/>
+      <w:r>
+        <w:rPr>
+          <w:rFonts w:asciiTheme="majorBidi" w:hAnsiTheme="majorBidi" w:cstheme="majorBidi"/>
+          <w:b/>
+          <w:bCs/>
+          <w:i/>
+          <w:iCs/>
+          <w:sz w:val="28"/>
+          <w:szCs w:val="28"/>
+        </w:rPr>
+        <w:t xml:space="preserve"> aux | grep nginx</w:t>
       </w:r>
       <w:r>
         <w:rPr>
@@ -4081,14 +4293,23 @@
           <w:szCs w:val="28"/>
         </w:rPr>
       </w:pPr>
-      <w:r>
-        <w:rPr>
-          <w:rFonts w:asciiTheme="majorBidi" w:hAnsiTheme="majorBidi" w:cstheme="majorBidi"/>
-          <w:sz w:val="28"/>
-          <w:szCs w:val="28"/>
-        </w:rPr>
-        <w:lastRenderedPageBreak/>
-        <w:t>So container root becomes an unprivileged user on host.</w:t>
+      <w:proofErr w:type="gramStart"/>
+      <w:r>
+        <w:rPr>
+          <w:rFonts w:asciiTheme="majorBidi" w:hAnsiTheme="majorBidi" w:cstheme="majorBidi"/>
+          <w:sz w:val="28"/>
+          <w:szCs w:val="28"/>
+        </w:rPr>
+        <w:t>So</w:t>
+      </w:r>
+      <w:proofErr w:type="gramEnd"/>
+      <w:r>
+        <w:rPr>
+          <w:rFonts w:asciiTheme="majorBidi" w:hAnsiTheme="majorBidi" w:cstheme="majorBidi"/>
+          <w:sz w:val="28"/>
+          <w:szCs w:val="28"/>
+        </w:rPr>
+        <w:t xml:space="preserve"> container root becomes an unprivileged user on host.</w:t>
       </w:r>
     </w:p>
     <w:p>
@@ -4127,13 +4348,10 @@
           <w:sz w:val="28"/>
           <w:szCs w:val="28"/>
         </w:rPr>
-        <w:t>id → uid=0(root)</w:t>
-      </w:r>
-    </w:p>
-    <w:p>
-      <w:pPr>
-        <w:ind w:left="360"/>
-        <w:jc w:val="both"/>
+        <w:t xml:space="preserve">id → </w:t>
+      </w:r>
+      <w:proofErr w:type="spellStart"/>
+      <w:r>
         <w:rPr>
           <w:rFonts w:asciiTheme="majorBidi" w:hAnsiTheme="majorBidi" w:cstheme="majorBidi"/>
           <w:b/>
@@ -4143,23 +4361,9 @@
           <w:sz w:val="28"/>
           <w:szCs w:val="28"/>
         </w:rPr>
-      </w:pPr>
-      <w:r>
-        <w:rPr>
-          <w:rFonts w:asciiTheme="majorBidi" w:hAnsiTheme="majorBidi" w:cstheme="majorBidi"/>
-          <w:sz w:val="28"/>
-          <w:szCs w:val="28"/>
-        </w:rPr>
-        <w:t>Host sees:</w:t>
-      </w:r>
-      <w:r>
-        <w:rPr>
-          <w:rFonts w:asciiTheme="majorBidi" w:hAnsiTheme="majorBidi" w:cstheme="majorBidi"/>
-          <w:sz w:val="28"/>
-          <w:szCs w:val="28"/>
-        </w:rPr>
-        <w:t xml:space="preserve"> </w:t>
-      </w:r>
+        <w:t>uid</w:t>
+      </w:r>
+      <w:proofErr w:type="spellEnd"/>
       <w:r>
         <w:rPr>
           <w:rFonts w:asciiTheme="majorBidi" w:hAnsiTheme="majorBidi" w:cstheme="majorBidi"/>
@@ -4170,9 +4374,13 @@
           <w:sz w:val="28"/>
           <w:szCs w:val="28"/>
         </w:rPr>
-        <w:t>uid=100000</w:t>
-      </w:r>
-      <w:r>
+        <w:t>=0(root)</w:t>
+      </w:r>
+    </w:p>
+    <w:p>
+      <w:pPr>
+        <w:ind w:left="360"/>
+        <w:jc w:val="both"/>
         <w:rPr>
           <w:rFonts w:asciiTheme="majorBidi" w:hAnsiTheme="majorBidi" w:cstheme="majorBidi"/>
           <w:b/>
@@ -4182,16 +4390,24 @@
           <w:sz w:val="28"/>
           <w:szCs w:val="28"/>
         </w:rPr>
+      </w:pPr>
+      <w:r>
+        <w:rPr>
+          <w:rFonts w:asciiTheme="majorBidi" w:hAnsiTheme="majorBidi" w:cstheme="majorBidi"/>
+          <w:sz w:val="28"/>
+          <w:szCs w:val="28"/>
+        </w:rPr>
+        <w:t>Host sees:</w:t>
+      </w:r>
+      <w:r>
+        <w:rPr>
+          <w:rFonts w:asciiTheme="majorBidi" w:hAnsiTheme="majorBidi" w:cstheme="majorBidi"/>
+          <w:sz w:val="28"/>
+          <w:szCs w:val="28"/>
+        </w:rPr>
         <w:t xml:space="preserve"> </w:t>
       </w:r>
-      <w:r>
-        <w:rPr>
-          <w:rFonts w:asciiTheme="majorBidi" w:hAnsiTheme="majorBidi" w:cstheme="majorBidi"/>
-          <w:sz w:val="28"/>
-          <w:szCs w:val="28"/>
-        </w:rPr>
-        <w:t>→</w:t>
-      </w:r>
+      <w:proofErr w:type="spellStart"/>
       <w:r>
         <w:rPr>
           <w:rFonts w:asciiTheme="majorBidi" w:hAnsiTheme="majorBidi" w:cstheme="majorBidi"/>
@@ -4202,16 +4418,9 @@
           <w:sz w:val="28"/>
           <w:szCs w:val="28"/>
         </w:rPr>
-        <w:t xml:space="preserve"> </w:t>
-      </w:r>
-      <w:r>
-        <w:rPr>
-          <w:rFonts w:asciiTheme="majorBidi" w:hAnsiTheme="majorBidi" w:cstheme="majorBidi"/>
-          <w:sz w:val="28"/>
-          <w:szCs w:val="28"/>
-        </w:rPr>
-        <w:t>This is not root.</w:t>
-      </w:r>
+        <w:t>uid</w:t>
+      </w:r>
+      <w:proofErr w:type="spellEnd"/>
       <w:r>
         <w:rPr>
           <w:rFonts w:asciiTheme="majorBidi" w:hAnsiTheme="majorBidi" w:cstheme="majorBidi"/>
@@ -4222,6 +4431,18 @@
           <w:sz w:val="28"/>
           <w:szCs w:val="28"/>
         </w:rPr>
+        <w:t>=100000</w:t>
+      </w:r>
+      <w:r>
+        <w:rPr>
+          <w:rFonts w:asciiTheme="majorBidi" w:hAnsiTheme="majorBidi" w:cstheme="majorBidi"/>
+          <w:b/>
+          <w:bCs/>
+          <w:i/>
+          <w:iCs/>
+          <w:sz w:val="28"/>
+          <w:szCs w:val="28"/>
+        </w:rPr>
         <w:t xml:space="preserve"> </w:t>
       </w:r>
       <w:r>
@@ -4230,6 +4451,46 @@
           <w:sz w:val="28"/>
           <w:szCs w:val="28"/>
         </w:rPr>
+        <w:t>→</w:t>
+      </w:r>
+      <w:r>
+        <w:rPr>
+          <w:rFonts w:asciiTheme="majorBidi" w:hAnsiTheme="majorBidi" w:cstheme="majorBidi"/>
+          <w:b/>
+          <w:bCs/>
+          <w:i/>
+          <w:iCs/>
+          <w:sz w:val="28"/>
+          <w:szCs w:val="28"/>
+        </w:rPr>
+        <w:t xml:space="preserve"> </w:t>
+      </w:r>
+      <w:r>
+        <w:rPr>
+          <w:rFonts w:asciiTheme="majorBidi" w:hAnsiTheme="majorBidi" w:cstheme="majorBidi"/>
+          <w:sz w:val="28"/>
+          <w:szCs w:val="28"/>
+        </w:rPr>
+        <w:t>This is not root.</w:t>
+      </w:r>
+      <w:r>
+        <w:rPr>
+          <w:rFonts w:asciiTheme="majorBidi" w:hAnsiTheme="majorBidi" w:cstheme="majorBidi"/>
+          <w:b/>
+          <w:bCs/>
+          <w:i/>
+          <w:iCs/>
+          <w:sz w:val="28"/>
+          <w:szCs w:val="28"/>
+        </w:rPr>
+        <w:t xml:space="preserve"> </w:t>
+      </w:r>
+      <w:r>
+        <w:rPr>
+          <w:rFonts w:asciiTheme="majorBidi" w:hAnsiTheme="majorBidi" w:cstheme="majorBidi"/>
+          <w:sz w:val="28"/>
+          <w:szCs w:val="28"/>
+        </w:rPr>
         <w:t>This is a restricted user.</w:t>
       </w:r>
     </w:p>
@@ -4320,6 +4581,7 @@
           <w:sz w:val="28"/>
           <w:szCs w:val="28"/>
         </w:rPr>
+        <w:lastRenderedPageBreak/>
         <w:t>User namespaces can break:</w:t>
       </w:r>
     </w:p>
@@ -4405,13 +4667,23 @@
           <w:szCs w:val="28"/>
         </w:rPr>
       </w:pPr>
-      <w:r>
-        <w:rPr>
-          <w:rFonts w:asciiTheme="majorBidi" w:hAnsiTheme="majorBidi" w:cstheme="majorBidi"/>
-          <w:sz w:val="28"/>
-          <w:szCs w:val="28"/>
-        </w:rPr>
-        <w:t>So Docker leaves it disabled unless you enable it manually.</w:t>
+      <w:proofErr w:type="gramStart"/>
+      <w:r>
+        <w:rPr>
+          <w:rFonts w:asciiTheme="majorBidi" w:hAnsiTheme="majorBidi" w:cstheme="majorBidi"/>
+          <w:sz w:val="28"/>
+          <w:szCs w:val="28"/>
+        </w:rPr>
+        <w:t>So</w:t>
+      </w:r>
+      <w:proofErr w:type="gramEnd"/>
+      <w:r>
+        <w:rPr>
+          <w:rFonts w:asciiTheme="majorBidi" w:hAnsiTheme="majorBidi" w:cstheme="majorBidi"/>
+          <w:sz w:val="28"/>
+          <w:szCs w:val="28"/>
+        </w:rPr>
+        <w:t xml:space="preserve"> Docker leaves it disabled unless you enable it manually.</w:t>
       </w:r>
     </w:p>
     <w:p>
@@ -4558,8 +4830,62 @@
           <w:sz w:val="28"/>
           <w:szCs w:val="28"/>
         </w:rPr>
-        <w:t>docker inspect --format '{{.State.Pid}}' container_id</w:t>
-      </w:r>
+        <w:t>docker inspect --format '{</w:t>
+      </w:r>
+      <w:proofErr w:type="gramStart"/>
+      <w:r>
+        <w:rPr>
+          <w:rFonts w:asciiTheme="majorBidi" w:hAnsiTheme="majorBidi" w:cstheme="majorBidi"/>
+          <w:b/>
+          <w:bCs/>
+          <w:i/>
+          <w:iCs/>
+          <w:sz w:val="28"/>
+          <w:szCs w:val="28"/>
+        </w:rPr>
+        <w:t>{.</w:t>
+      </w:r>
+      <w:proofErr w:type="spellStart"/>
+      <w:r>
+        <w:rPr>
+          <w:rFonts w:asciiTheme="majorBidi" w:hAnsiTheme="majorBidi" w:cstheme="majorBidi"/>
+          <w:b/>
+          <w:bCs/>
+          <w:i/>
+          <w:iCs/>
+          <w:sz w:val="28"/>
+          <w:szCs w:val="28"/>
+        </w:rPr>
+        <w:t>State.Pid</w:t>
+      </w:r>
+      <w:proofErr w:type="spellEnd"/>
+      <w:proofErr w:type="gramEnd"/>
+      <w:r>
+        <w:rPr>
+          <w:rFonts w:asciiTheme="majorBidi" w:hAnsiTheme="majorBidi" w:cstheme="majorBidi"/>
+          <w:b/>
+          <w:bCs/>
+          <w:i/>
+          <w:iCs/>
+          <w:sz w:val="28"/>
+          <w:szCs w:val="28"/>
+        </w:rPr>
+        <w:t xml:space="preserve">}}' </w:t>
+      </w:r>
+      <w:proofErr w:type="spellStart"/>
+      <w:r>
+        <w:rPr>
+          <w:rFonts w:asciiTheme="majorBidi" w:hAnsiTheme="majorBidi" w:cstheme="majorBidi"/>
+          <w:b/>
+          <w:bCs/>
+          <w:i/>
+          <w:iCs/>
+          <w:sz w:val="28"/>
+          <w:szCs w:val="28"/>
+        </w:rPr>
+        <w:t>container_id</w:t>
+      </w:r>
+      <w:proofErr w:type="spellEnd"/>
       <w:r>
         <w:rPr>
           <w:rFonts w:asciiTheme="majorBidi" w:hAnsiTheme="majorBidi" w:cstheme="majorBidi"/>
@@ -4654,13 +4980,51 @@
           <w:szCs w:val="28"/>
         </w:rPr>
       </w:pPr>
-      <w:r>
-        <w:rPr>
-          <w:rFonts w:asciiTheme="majorBidi" w:hAnsiTheme="majorBidi" w:cstheme="majorBidi"/>
-          <w:sz w:val="28"/>
-          <w:szCs w:val="28"/>
-        </w:rPr>
-        <w:t>ps -o pid,uid,gid,cmd -p 23456</w:t>
+      <w:proofErr w:type="spellStart"/>
+      <w:r>
+        <w:rPr>
+          <w:rFonts w:asciiTheme="majorBidi" w:hAnsiTheme="majorBidi" w:cstheme="majorBidi"/>
+          <w:sz w:val="28"/>
+          <w:szCs w:val="28"/>
+        </w:rPr>
+        <w:t>ps</w:t>
+      </w:r>
+      <w:proofErr w:type="spellEnd"/>
+      <w:r>
+        <w:rPr>
+          <w:rFonts w:asciiTheme="majorBidi" w:hAnsiTheme="majorBidi" w:cstheme="majorBidi"/>
+          <w:sz w:val="28"/>
+          <w:szCs w:val="28"/>
+        </w:rPr>
+        <w:t xml:space="preserve"> -o </w:t>
+      </w:r>
+      <w:proofErr w:type="spellStart"/>
+      <w:proofErr w:type="gramStart"/>
+      <w:r>
+        <w:rPr>
+          <w:rFonts w:asciiTheme="majorBidi" w:hAnsiTheme="majorBidi" w:cstheme="majorBidi"/>
+          <w:sz w:val="28"/>
+          <w:szCs w:val="28"/>
+        </w:rPr>
+        <w:t>pid,uid</w:t>
+      </w:r>
+      <w:proofErr w:type="gramEnd"/>
+      <w:r>
+        <w:rPr>
+          <w:rFonts w:asciiTheme="majorBidi" w:hAnsiTheme="majorBidi" w:cstheme="majorBidi"/>
+          <w:sz w:val="28"/>
+          <w:szCs w:val="28"/>
+        </w:rPr>
+        <w:t>,gid,cmd</w:t>
+      </w:r>
+      <w:proofErr w:type="spellEnd"/>
+      <w:r>
+        <w:rPr>
+          <w:rFonts w:asciiTheme="majorBidi" w:hAnsiTheme="majorBidi" w:cstheme="majorBidi"/>
+          <w:sz w:val="28"/>
+          <w:szCs w:val="28"/>
+        </w:rPr>
+        <w:t xml:space="preserve"> -p 23456</w:t>
       </w:r>
       <w:r>
         <w:rPr>
@@ -5664,7 +6028,6 @@
           <w:sz w:val="28"/>
           <w:szCs w:val="28"/>
         </w:rPr>
-        <w:lastRenderedPageBreak/>
         <w:t>Even if UID is same, namespaces restrict access.</w:t>
       </w:r>
       <w:r>
@@ -5723,13 +6086,23 @@
         </w:rPr>
         <w:t xml:space="preserve"> </w:t>
       </w:r>
-      <w:r>
-        <w:rPr>
-          <w:rFonts w:asciiTheme="majorBidi" w:hAnsiTheme="majorBidi" w:cstheme="majorBidi"/>
-          <w:sz w:val="28"/>
-          <w:szCs w:val="28"/>
-        </w:rPr>
-        <w:t>cgroups weaken the process.</w:t>
+      <w:proofErr w:type="spellStart"/>
+      <w:r>
+        <w:rPr>
+          <w:rFonts w:asciiTheme="majorBidi" w:hAnsiTheme="majorBidi" w:cstheme="majorBidi"/>
+          <w:sz w:val="28"/>
+          <w:szCs w:val="28"/>
+        </w:rPr>
+        <w:t>cgroups</w:t>
+      </w:r>
+      <w:proofErr w:type="spellEnd"/>
+      <w:r>
+        <w:rPr>
+          <w:rFonts w:asciiTheme="majorBidi" w:hAnsiTheme="majorBidi" w:cstheme="majorBidi"/>
+          <w:sz w:val="28"/>
+          <w:szCs w:val="28"/>
+        </w:rPr>
+        <w:t xml:space="preserve"> weaken the process.</w:t>
       </w:r>
       <w:r>
         <w:rPr>
@@ -5933,6 +6306,7 @@
           <w:sz w:val="28"/>
           <w:szCs w:val="28"/>
         </w:rPr>
+        <w:lastRenderedPageBreak/>
         <w:t>This reduces damage potential.</w:t>
       </w:r>
       <w:r>
@@ -5997,7 +6371,25 @@
           <w:sz w:val="28"/>
           <w:szCs w:val="28"/>
         </w:rPr>
-        <w:t>This isolates visibility of cgroup hierarchy.</w:t>
+        <w:t xml:space="preserve">This isolates visibility of </w:t>
+      </w:r>
+      <w:proofErr w:type="spellStart"/>
+      <w:r>
+        <w:rPr>
+          <w:rFonts w:asciiTheme="majorBidi" w:hAnsiTheme="majorBidi" w:cstheme="majorBidi"/>
+          <w:sz w:val="28"/>
+          <w:szCs w:val="28"/>
+        </w:rPr>
+        <w:t>cgroup</w:t>
+      </w:r>
+      <w:proofErr w:type="spellEnd"/>
+      <w:r>
+        <w:rPr>
+          <w:rFonts w:asciiTheme="majorBidi" w:hAnsiTheme="majorBidi" w:cstheme="majorBidi"/>
+          <w:sz w:val="28"/>
+          <w:szCs w:val="28"/>
+        </w:rPr>
+        <w:t xml:space="preserve"> hierarchy.</w:t>
       </w:r>
       <w:r>
         <w:rPr>
@@ -6083,7 +6475,25 @@
           <w:sz w:val="28"/>
           <w:szCs w:val="28"/>
         </w:rPr>
-        <w:t>A container can still consume all CPU and memory without cgroups.</w:t>
+        <w:t xml:space="preserve">A container can still consume all CPU and memory without </w:t>
+      </w:r>
+      <w:proofErr w:type="spellStart"/>
+      <w:r>
+        <w:rPr>
+          <w:rFonts w:asciiTheme="majorBidi" w:hAnsiTheme="majorBidi" w:cstheme="majorBidi"/>
+          <w:sz w:val="28"/>
+          <w:szCs w:val="28"/>
+        </w:rPr>
+        <w:t>cgroups</w:t>
+      </w:r>
+      <w:proofErr w:type="spellEnd"/>
+      <w:r>
+        <w:rPr>
+          <w:rFonts w:asciiTheme="majorBidi" w:hAnsiTheme="majorBidi" w:cstheme="majorBidi"/>
+          <w:sz w:val="28"/>
+          <w:szCs w:val="28"/>
+        </w:rPr>
+        <w:t>.</w:t>
       </w:r>
     </w:p>
     <w:p>
@@ -6097,6 +6507,7 @@
           <w:szCs w:val="40"/>
         </w:rPr>
       </w:pPr>
+      <w:proofErr w:type="spellStart"/>
       <w:r>
         <w:rPr>
           <w:rFonts w:asciiTheme="majorBidi" w:hAnsiTheme="majorBidi" w:cstheme="majorBidi"/>
@@ -6105,8 +6516,9 @@
           <w:sz w:val="40"/>
           <w:szCs w:val="40"/>
         </w:rPr>
-        <w:t xml:space="preserve">cgroups </w:t>
-      </w:r>
+        <w:t>cgroups</w:t>
+      </w:r>
+      <w:proofErr w:type="spellEnd"/>
       <w:r>
         <w:rPr>
           <w:rFonts w:asciiTheme="majorBidi" w:hAnsiTheme="majorBidi" w:cstheme="majorBidi"/>
@@ -6115,7 +6527,7 @@
           <w:sz w:val="40"/>
           <w:szCs w:val="40"/>
         </w:rPr>
-        <w:t>-</w:t>
+        <w:t xml:space="preserve"> </w:t>
       </w:r>
       <w:r>
         <w:rPr>
@@ -6125,7 +6537,7 @@
           <w:sz w:val="40"/>
           <w:szCs w:val="40"/>
         </w:rPr>
-        <w:t xml:space="preserve"> Resource Control</w:t>
+        <w:t>-</w:t>
       </w:r>
       <w:r>
         <w:rPr>
@@ -6135,6 +6547,16 @@
           <w:sz w:val="40"/>
           <w:szCs w:val="40"/>
         </w:rPr>
+        <w:t xml:space="preserve"> Resource Control</w:t>
+      </w:r>
+      <w:r>
+        <w:rPr>
+          <w:rFonts w:asciiTheme="majorBidi" w:hAnsiTheme="majorBidi" w:cstheme="majorBidi"/>
+          <w:b/>
+          <w:bCs/>
+          <w:sz w:val="40"/>
+          <w:szCs w:val="40"/>
+        </w:rPr>
         <w:t>:</w:t>
       </w:r>
     </w:p>
@@ -6147,13 +6569,23 @@
           <w:szCs w:val="28"/>
         </w:rPr>
       </w:pPr>
-      <w:r>
-        <w:rPr>
-          <w:rFonts w:asciiTheme="majorBidi" w:hAnsiTheme="majorBidi" w:cstheme="majorBidi"/>
-          <w:sz w:val="28"/>
-          <w:szCs w:val="28"/>
-        </w:rPr>
-        <w:t>cgroups = control groups</w:t>
+      <w:proofErr w:type="spellStart"/>
+      <w:r>
+        <w:rPr>
+          <w:rFonts w:asciiTheme="majorBidi" w:hAnsiTheme="majorBidi" w:cstheme="majorBidi"/>
+          <w:sz w:val="28"/>
+          <w:szCs w:val="28"/>
+        </w:rPr>
+        <w:t>cgroups</w:t>
+      </w:r>
+      <w:proofErr w:type="spellEnd"/>
+      <w:r>
+        <w:rPr>
+          <w:rFonts w:asciiTheme="majorBidi" w:hAnsiTheme="majorBidi" w:cstheme="majorBidi"/>
+          <w:sz w:val="28"/>
+          <w:szCs w:val="28"/>
+        </w:rPr>
+        <w:t xml:space="preserve"> = control groups</w:t>
       </w:r>
       <w:r>
         <w:rPr>
@@ -6299,7 +6731,25 @@
           <w:sz w:val="28"/>
           <w:szCs w:val="28"/>
         </w:rPr>
-        <w:t>Docker uses cgroups to enforce limits.</w:t>
+        <w:t xml:space="preserve">Docker uses </w:t>
+      </w:r>
+      <w:proofErr w:type="spellStart"/>
+      <w:r>
+        <w:rPr>
+          <w:rFonts w:asciiTheme="majorBidi" w:hAnsiTheme="majorBidi" w:cstheme="majorBidi"/>
+          <w:sz w:val="28"/>
+          <w:szCs w:val="28"/>
+        </w:rPr>
+        <w:t>cgroups</w:t>
+      </w:r>
+      <w:proofErr w:type="spellEnd"/>
+      <w:r>
+        <w:rPr>
+          <w:rFonts w:asciiTheme="majorBidi" w:hAnsiTheme="majorBidi" w:cstheme="majorBidi"/>
+          <w:sz w:val="28"/>
+          <w:szCs w:val="28"/>
+        </w:rPr>
+        <w:t xml:space="preserve"> to enforce limits.</w:t>
       </w:r>
     </w:p>
     <w:p>
@@ -6321,7 +6771,29 @@
           <w:sz w:val="36"/>
           <w:szCs w:val="36"/>
         </w:rPr>
-        <w:t>What cgroups Control</w:t>
+        <w:t xml:space="preserve">What </w:t>
+      </w:r>
+      <w:proofErr w:type="spellStart"/>
+      <w:r>
+        <w:rPr>
+          <w:rFonts w:asciiTheme="majorBidi" w:hAnsiTheme="majorBidi" w:cstheme="majorBidi"/>
+          <w:b/>
+          <w:bCs/>
+          <w:sz w:val="36"/>
+          <w:szCs w:val="36"/>
+        </w:rPr>
+        <w:t>cgroups</w:t>
+      </w:r>
+      <w:proofErr w:type="spellEnd"/>
+      <w:r>
+        <w:rPr>
+          <w:rFonts w:asciiTheme="majorBidi" w:hAnsiTheme="majorBidi" w:cstheme="majorBidi"/>
+          <w:b/>
+          <w:bCs/>
+          <w:sz w:val="36"/>
+          <w:szCs w:val="36"/>
+        </w:rPr>
+        <w:t xml:space="preserve"> Control</w:t>
       </w:r>
       <w:r>
         <w:rPr>
@@ -6465,7 +6937,25 @@
           <w:sz w:val="28"/>
           <w:szCs w:val="28"/>
         </w:rPr>
-        <w:t>OOM = Out Of Memory</w:t>
+        <w:t xml:space="preserve">OOM = Out </w:t>
+      </w:r>
+      <w:proofErr w:type="gramStart"/>
+      <w:r>
+        <w:rPr>
+          <w:rFonts w:asciiTheme="majorBidi" w:hAnsiTheme="majorBidi" w:cstheme="majorBidi"/>
+          <w:sz w:val="28"/>
+          <w:szCs w:val="28"/>
+        </w:rPr>
+        <w:t>Of</w:t>
+      </w:r>
+      <w:proofErr w:type="gramEnd"/>
+      <w:r>
+        <w:rPr>
+          <w:rFonts w:asciiTheme="majorBidi" w:hAnsiTheme="majorBidi" w:cstheme="majorBidi"/>
+          <w:sz w:val="28"/>
+          <w:szCs w:val="28"/>
+        </w:rPr>
+        <w:t xml:space="preserve"> Memory</w:t>
       </w:r>
       <w:r>
         <w:rPr>
@@ -6587,8 +7077,33 @@
           <w:sz w:val="28"/>
           <w:szCs w:val="28"/>
         </w:rPr>
-        <w:lastRenderedPageBreak/>
-        <w:t>docker run --cpus=1 nginx</w:t>
+        <w:t>docker run --</w:t>
+      </w:r>
+      <w:proofErr w:type="spellStart"/>
+      <w:r>
+        <w:rPr>
+          <w:rFonts w:asciiTheme="majorBidi" w:hAnsiTheme="majorBidi" w:cstheme="majorBidi"/>
+          <w:b/>
+          <w:bCs/>
+          <w:i/>
+          <w:iCs/>
+          <w:sz w:val="28"/>
+          <w:szCs w:val="28"/>
+        </w:rPr>
+        <w:t>cpus</w:t>
+      </w:r>
+      <w:proofErr w:type="spellEnd"/>
+      <w:r>
+        <w:rPr>
+          <w:rFonts w:asciiTheme="majorBidi" w:hAnsiTheme="majorBidi" w:cstheme="majorBidi"/>
+          <w:b/>
+          <w:bCs/>
+          <w:i/>
+          <w:iCs/>
+          <w:sz w:val="28"/>
+          <w:szCs w:val="28"/>
+        </w:rPr>
+        <w:t>=1 nginx</w:t>
       </w:r>
       <w:r>
         <w:rPr>
@@ -6673,13 +7188,23 @@
           <w:szCs w:val="28"/>
         </w:rPr>
       </w:pPr>
-      <w:r>
-        <w:rPr>
-          <w:rFonts w:asciiTheme="majorBidi" w:hAnsiTheme="majorBidi" w:cstheme="majorBidi"/>
-          <w:sz w:val="28"/>
-          <w:szCs w:val="28"/>
-        </w:rPr>
-        <w:t>cpu quota</w:t>
+      <w:proofErr w:type="spellStart"/>
+      <w:r>
+        <w:rPr>
+          <w:rFonts w:asciiTheme="majorBidi" w:hAnsiTheme="majorBidi" w:cstheme="majorBidi"/>
+          <w:sz w:val="28"/>
+          <w:szCs w:val="28"/>
+        </w:rPr>
+        <w:t>cpu</w:t>
+      </w:r>
+      <w:proofErr w:type="spellEnd"/>
+      <w:r>
+        <w:rPr>
+          <w:rFonts w:asciiTheme="majorBidi" w:hAnsiTheme="majorBidi" w:cstheme="majorBidi"/>
+          <w:sz w:val="28"/>
+          <w:szCs w:val="28"/>
+        </w:rPr>
+        <w:t xml:space="preserve"> quota</w:t>
       </w:r>
     </w:p>
     <w:p>
@@ -6697,13 +7222,23 @@
           <w:szCs w:val="28"/>
         </w:rPr>
       </w:pPr>
-      <w:r>
-        <w:rPr>
-          <w:rFonts w:asciiTheme="majorBidi" w:hAnsiTheme="majorBidi" w:cstheme="majorBidi"/>
-          <w:sz w:val="28"/>
-          <w:szCs w:val="28"/>
-        </w:rPr>
-        <w:t>cpu period</w:t>
+      <w:proofErr w:type="spellStart"/>
+      <w:r>
+        <w:rPr>
+          <w:rFonts w:asciiTheme="majorBidi" w:hAnsiTheme="majorBidi" w:cstheme="majorBidi"/>
+          <w:sz w:val="28"/>
+          <w:szCs w:val="28"/>
+        </w:rPr>
+        <w:t>cpu</w:t>
+      </w:r>
+      <w:proofErr w:type="spellEnd"/>
+      <w:r>
+        <w:rPr>
+          <w:rFonts w:asciiTheme="majorBidi" w:hAnsiTheme="majorBidi" w:cstheme="majorBidi"/>
+          <w:sz w:val="28"/>
+          <w:szCs w:val="28"/>
+        </w:rPr>
+        <w:t xml:space="preserve"> period</w:t>
       </w:r>
     </w:p>
     <w:p>
@@ -6746,7 +7281,25 @@
           <w:sz w:val="28"/>
           <w:szCs w:val="28"/>
         </w:rPr>
-        <w:t>--cpu-quota=50000</w:t>
+        <w:t>--</w:t>
+      </w:r>
+      <w:proofErr w:type="spellStart"/>
+      <w:r>
+        <w:rPr>
+          <w:rFonts w:asciiTheme="majorBidi" w:hAnsiTheme="majorBidi" w:cstheme="majorBidi"/>
+          <w:sz w:val="28"/>
+          <w:szCs w:val="28"/>
+        </w:rPr>
+        <w:t>cpu</w:t>
+      </w:r>
+      <w:proofErr w:type="spellEnd"/>
+      <w:r>
+        <w:rPr>
+          <w:rFonts w:asciiTheme="majorBidi" w:hAnsiTheme="majorBidi" w:cstheme="majorBidi"/>
+          <w:sz w:val="28"/>
+          <w:szCs w:val="28"/>
+        </w:rPr>
+        <w:t>-quota=50000</w:t>
       </w:r>
     </w:p>
     <w:p>
@@ -6770,7 +7323,25 @@
           <w:sz w:val="28"/>
           <w:szCs w:val="28"/>
         </w:rPr>
-        <w:t>--cpu-period=100000</w:t>
+        <w:t>--</w:t>
+      </w:r>
+      <w:proofErr w:type="spellStart"/>
+      <w:r>
+        <w:rPr>
+          <w:rFonts w:asciiTheme="majorBidi" w:hAnsiTheme="majorBidi" w:cstheme="majorBidi"/>
+          <w:sz w:val="28"/>
+          <w:szCs w:val="28"/>
+        </w:rPr>
+        <w:t>cpu</w:t>
+      </w:r>
+      <w:proofErr w:type="spellEnd"/>
+      <w:r>
+        <w:rPr>
+          <w:rFonts w:asciiTheme="majorBidi" w:hAnsiTheme="majorBidi" w:cstheme="majorBidi"/>
+          <w:sz w:val="28"/>
+          <w:szCs w:val="28"/>
+        </w:rPr>
+        <w:t>-period=100000</w:t>
       </w:r>
     </w:p>
     <w:p>
@@ -6863,8 +7434,10 @@
           <w:sz w:val="28"/>
           <w:szCs w:val="28"/>
         </w:rPr>
-        <w:t>docker run --pids-limit=100 nginx</w:t>
-      </w:r>
+        <w:lastRenderedPageBreak/>
+        <w:t>docker run --</w:t>
+      </w:r>
+      <w:proofErr w:type="spellStart"/>
       <w:r>
         <w:rPr>
           <w:rFonts w:asciiTheme="majorBidi" w:hAnsiTheme="majorBidi" w:cstheme="majorBidi"/>
@@ -6875,24 +7448,9 @@
           <w:sz w:val="28"/>
           <w:szCs w:val="28"/>
         </w:rPr>
-        <w:t xml:space="preserve"> </w:t>
-      </w:r>
-      <w:r>
-        <w:rPr>
-          <w:rFonts w:asciiTheme="majorBidi" w:hAnsiTheme="majorBidi" w:cstheme="majorBidi"/>
-          <w:sz w:val="28"/>
-          <w:szCs w:val="28"/>
-        </w:rPr>
-        <w:t xml:space="preserve">→ </w:t>
-      </w:r>
-      <w:r>
-        <w:rPr>
-          <w:rFonts w:asciiTheme="majorBidi" w:hAnsiTheme="majorBidi" w:cstheme="majorBidi"/>
-          <w:sz w:val="28"/>
-          <w:szCs w:val="28"/>
-        </w:rPr>
-        <w:t>Container can only create 100 processes.</w:t>
-      </w:r>
+        <w:t>pids</w:t>
+      </w:r>
+      <w:proofErr w:type="spellEnd"/>
       <w:r>
         <w:rPr>
           <w:rFonts w:asciiTheme="majorBidi" w:hAnsiTheme="majorBidi" w:cstheme="majorBidi"/>
@@ -6903,15 +7461,7 @@
           <w:sz w:val="28"/>
           <w:szCs w:val="28"/>
         </w:rPr>
-        <w:t xml:space="preserve"> </w:t>
-      </w:r>
-      <w:r>
-        <w:rPr>
-          <w:rFonts w:asciiTheme="majorBidi" w:hAnsiTheme="majorBidi" w:cstheme="majorBidi"/>
-          <w:sz w:val="28"/>
-          <w:szCs w:val="28"/>
-        </w:rPr>
-        <w:t>Prevents fork bombs.</w:t>
+        <w:t>-limit=100 nginx</w:t>
       </w:r>
       <w:r>
         <w:rPr>
@@ -6931,7 +7481,15 @@
           <w:sz w:val="28"/>
           <w:szCs w:val="28"/>
         </w:rPr>
-        <w:t>A fork bomb can crash a system by creating infinite processes.</w:t>
+        <w:t xml:space="preserve">→ </w:t>
+      </w:r>
+      <w:r>
+        <w:rPr>
+          <w:rFonts w:asciiTheme="majorBidi" w:hAnsiTheme="majorBidi" w:cstheme="majorBidi"/>
+          <w:sz w:val="28"/>
+          <w:szCs w:val="28"/>
+        </w:rPr>
+        <w:t>Container can only create 100 processes.</w:t>
       </w:r>
       <w:r>
         <w:rPr>
@@ -6951,7 +7509,57 @@
           <w:sz w:val="28"/>
           <w:szCs w:val="28"/>
         </w:rPr>
-        <w:t>cgroups stop this.</w:t>
+        <w:t>Prevents fork bombs.</w:t>
+      </w:r>
+      <w:r>
+        <w:rPr>
+          <w:rFonts w:asciiTheme="majorBidi" w:hAnsiTheme="majorBidi" w:cstheme="majorBidi"/>
+          <w:b/>
+          <w:bCs/>
+          <w:i/>
+          <w:iCs/>
+          <w:sz w:val="28"/>
+          <w:szCs w:val="28"/>
+        </w:rPr>
+        <w:t xml:space="preserve"> </w:t>
+      </w:r>
+      <w:r>
+        <w:rPr>
+          <w:rFonts w:asciiTheme="majorBidi" w:hAnsiTheme="majorBidi" w:cstheme="majorBidi"/>
+          <w:sz w:val="28"/>
+          <w:szCs w:val="28"/>
+        </w:rPr>
+        <w:t>A fork bomb can crash a system by creating infinite processes.</w:t>
+      </w:r>
+      <w:r>
+        <w:rPr>
+          <w:rFonts w:asciiTheme="majorBidi" w:hAnsiTheme="majorBidi" w:cstheme="majorBidi"/>
+          <w:b/>
+          <w:bCs/>
+          <w:i/>
+          <w:iCs/>
+          <w:sz w:val="28"/>
+          <w:szCs w:val="28"/>
+        </w:rPr>
+        <w:t xml:space="preserve"> </w:t>
+      </w:r>
+      <w:proofErr w:type="spellStart"/>
+      <w:r>
+        <w:rPr>
+          <w:rFonts w:asciiTheme="majorBidi" w:hAnsiTheme="majorBidi" w:cstheme="majorBidi"/>
+          <w:sz w:val="28"/>
+          <w:szCs w:val="28"/>
+        </w:rPr>
+        <w:t>cgroups</w:t>
+      </w:r>
+      <w:proofErr w:type="spellEnd"/>
+      <w:r>
+        <w:rPr>
+          <w:rFonts w:asciiTheme="majorBidi" w:hAnsiTheme="majorBidi" w:cstheme="majorBidi"/>
+          <w:sz w:val="28"/>
+          <w:szCs w:val="28"/>
+        </w:rPr>
+        <w:t xml:space="preserve"> stop this.</w:t>
       </w:r>
     </w:p>
     <w:p>
@@ -7100,7 +7708,29 @@
           <w:sz w:val="32"/>
           <w:szCs w:val="32"/>
         </w:rPr>
-        <w:t>How Docker Uses Namespaces and cgroups Together</w:t>
+        <w:t xml:space="preserve">How Docker Uses Namespaces and </w:t>
+      </w:r>
+      <w:proofErr w:type="spellStart"/>
+      <w:r>
+        <w:rPr>
+          <w:rFonts w:asciiTheme="majorBidi" w:hAnsiTheme="majorBidi" w:cstheme="majorBidi"/>
+          <w:b/>
+          <w:bCs/>
+          <w:sz w:val="32"/>
+          <w:szCs w:val="32"/>
+        </w:rPr>
+        <w:t>cgroups</w:t>
+      </w:r>
+      <w:proofErr w:type="spellEnd"/>
+      <w:r>
+        <w:rPr>
+          <w:rFonts w:asciiTheme="majorBidi" w:hAnsiTheme="majorBidi" w:cstheme="majorBidi"/>
+          <w:b/>
+          <w:bCs/>
+          <w:sz w:val="32"/>
+          <w:szCs w:val="32"/>
+        </w:rPr>
+        <w:t xml:space="preserve"> Together</w:t>
       </w:r>
       <w:r>
         <w:rPr>
@@ -7327,8 +7957,18 @@
           <w:sz w:val="28"/>
           <w:szCs w:val="28"/>
         </w:rPr>
-        <w:t>Creates cgroups</w:t>
-      </w:r>
+        <w:t xml:space="preserve">Creates </w:t>
+      </w:r>
+      <w:proofErr w:type="spellStart"/>
+      <w:r>
+        <w:rPr>
+          <w:rFonts w:asciiTheme="majorBidi" w:hAnsiTheme="majorBidi" w:cstheme="majorBidi"/>
+          <w:sz w:val="28"/>
+          <w:szCs w:val="28"/>
+        </w:rPr>
+        <w:t>cgroups</w:t>
+      </w:r>
+      <w:proofErr w:type="spellEnd"/>
     </w:p>
     <w:p>
       <w:pPr>
@@ -7499,7 +8139,6 @@
           <w:sz w:val="28"/>
           <w:szCs w:val="28"/>
         </w:rPr>
-        <w:lastRenderedPageBreak/>
         <w:t>Docker is the orchestrator.</w:t>
       </w:r>
     </w:p>
@@ -7570,7 +8209,27 @@
           <w:szCs w:val="28"/>
           <w:u w:val="single"/>
         </w:rPr>
-        <w:t>Without namespaces and cgroups:</w:t>
+        <w:t xml:space="preserve">Without namespaces and </w:t>
+      </w:r>
+      <w:proofErr w:type="spellStart"/>
+      <w:r>
+        <w:rPr>
+          <w:rFonts w:asciiTheme="majorBidi" w:hAnsiTheme="majorBidi" w:cstheme="majorBidi"/>
+          <w:sz w:val="28"/>
+          <w:szCs w:val="28"/>
+          <w:u w:val="single"/>
+        </w:rPr>
+        <w:t>cgroups</w:t>
+      </w:r>
+      <w:proofErr w:type="spellEnd"/>
+      <w:r>
+        <w:rPr>
+          <w:rFonts w:asciiTheme="majorBidi" w:hAnsiTheme="majorBidi" w:cstheme="majorBidi"/>
+          <w:sz w:val="28"/>
+          <w:szCs w:val="28"/>
+          <w:u w:val="single"/>
+        </w:rPr>
+        <w:t>:</w:t>
       </w:r>
     </w:p>
     <w:p>
@@ -7646,7 +8305,27 @@
           <w:szCs w:val="28"/>
           <w:u w:val="single"/>
         </w:rPr>
-        <w:t>With cgroups:</w:t>
+        <w:t xml:space="preserve">With </w:t>
+      </w:r>
+      <w:proofErr w:type="spellStart"/>
+      <w:r>
+        <w:rPr>
+          <w:rFonts w:asciiTheme="majorBidi" w:hAnsiTheme="majorBidi" w:cstheme="majorBidi"/>
+          <w:sz w:val="28"/>
+          <w:szCs w:val="28"/>
+          <w:u w:val="single"/>
+        </w:rPr>
+        <w:t>cgroups</w:t>
+      </w:r>
+      <w:proofErr w:type="spellEnd"/>
+      <w:r>
+        <w:rPr>
+          <w:rFonts w:asciiTheme="majorBidi" w:hAnsiTheme="majorBidi" w:cstheme="majorBidi"/>
+          <w:sz w:val="28"/>
+          <w:szCs w:val="28"/>
+          <w:u w:val="single"/>
+        </w:rPr>
+        <w:t>:</w:t>
       </w:r>
     </w:p>
     <w:p>
@@ -7720,6 +8399,7 @@
           <w:sz w:val="28"/>
           <w:szCs w:val="28"/>
         </w:rPr>
+        <w:lastRenderedPageBreak/>
         <w:t>See namespaces</w:t>
       </w:r>
       <w:r>
@@ -7730,6 +8410,7 @@
         </w:rPr>
         <w:t xml:space="preserve"> → </w:t>
       </w:r>
+      <w:proofErr w:type="spellStart"/>
       <w:r>
         <w:rPr>
           <w:rFonts w:asciiTheme="majorBidi" w:hAnsiTheme="majorBidi" w:cstheme="majorBidi"/>
@@ -7742,6 +8423,7 @@
         </w:rPr>
         <w:t>lsns</w:t>
       </w:r>
+      <w:proofErr w:type="spellEnd"/>
     </w:p>
     <w:p>
       <w:pPr>
@@ -7774,6 +8456,7 @@
         </w:rPr>
         <w:t xml:space="preserve"> → </w:t>
       </w:r>
+      <w:proofErr w:type="spellStart"/>
       <w:r>
         <w:rPr>
           <w:rFonts w:asciiTheme="majorBidi" w:hAnsiTheme="majorBidi" w:cstheme="majorBidi"/>
@@ -7786,6 +8469,7 @@
         </w:rPr>
         <w:t>nsenter</w:t>
       </w:r>
+      <w:proofErr w:type="spellEnd"/>
     </w:p>
     <w:p>
       <w:pPr>
@@ -7818,6 +8502,7 @@
         </w:rPr>
         <w:t xml:space="preserve"> → </w:t>
       </w:r>
+      <w:proofErr w:type="spellStart"/>
       <w:r>
         <w:rPr>
           <w:rFonts w:asciiTheme="majorBidi" w:hAnsiTheme="majorBidi" w:cstheme="majorBidi"/>
@@ -7830,6 +8515,7 @@
         </w:rPr>
         <w:t>unshare</w:t>
       </w:r>
+      <w:proofErr w:type="spellEnd"/>
     </w:p>
     <w:p>
       <w:pPr>
@@ -7852,8 +8538,18 @@
           <w:sz w:val="28"/>
           <w:szCs w:val="28"/>
         </w:rPr>
-        <w:t>See cgroups</w:t>
-      </w:r>
+        <w:t xml:space="preserve">See </w:t>
+      </w:r>
+      <w:proofErr w:type="spellStart"/>
+      <w:r>
+        <w:rPr>
+          <w:rFonts w:asciiTheme="majorBidi" w:hAnsiTheme="majorBidi" w:cstheme="majorBidi"/>
+          <w:sz w:val="28"/>
+          <w:szCs w:val="28"/>
+        </w:rPr>
+        <w:t>cgroups</w:t>
+      </w:r>
+      <w:proofErr w:type="spellEnd"/>
       <w:r>
         <w:rPr>
           <w:rFonts w:asciiTheme="majorBidi" w:hAnsiTheme="majorBidi" w:cstheme="majorBidi"/>
@@ -7872,8 +8568,22 @@
           <w:sz w:val="28"/>
           <w:szCs w:val="28"/>
         </w:rPr>
-        <w:t>cat /proc/self/cgroup</w:t>
-      </w:r>
+        <w:t>cat /proc/self/</w:t>
+      </w:r>
+      <w:proofErr w:type="spellStart"/>
+      <w:r>
+        <w:rPr>
+          <w:rFonts w:asciiTheme="majorBidi" w:hAnsiTheme="majorBidi" w:cstheme="majorBidi"/>
+          <w:b/>
+          <w:bCs/>
+          <w:i/>
+          <w:iCs/>
+          <w:sz w:val="28"/>
+          <w:szCs w:val="28"/>
+        </w:rPr>
+        <w:t>cgroup</w:t>
+      </w:r>
+      <w:proofErr w:type="spellEnd"/>
     </w:p>
     <w:p>
       <w:pPr>
@@ -7916,7 +8626,33 @@
           <w:sz w:val="28"/>
           <w:szCs w:val="28"/>
         </w:rPr>
-        <w:t>cat /sys/fs/cgroup/</w:t>
+        <w:t>cat /sys/fs/</w:t>
+      </w:r>
+      <w:proofErr w:type="spellStart"/>
+      <w:r>
+        <w:rPr>
+          <w:rFonts w:asciiTheme="majorBidi" w:hAnsiTheme="majorBidi" w:cstheme="majorBidi"/>
+          <w:b/>
+          <w:bCs/>
+          <w:i/>
+          <w:iCs/>
+          <w:sz w:val="28"/>
+          <w:szCs w:val="28"/>
+        </w:rPr>
+        <w:t>cgroup</w:t>
+      </w:r>
+      <w:proofErr w:type="spellEnd"/>
+      <w:r>
+        <w:rPr>
+          <w:rFonts w:asciiTheme="majorBidi" w:hAnsiTheme="majorBidi" w:cstheme="majorBidi"/>
+          <w:b/>
+          <w:bCs/>
+          <w:i/>
+          <w:iCs/>
+          <w:sz w:val="28"/>
+          <w:szCs w:val="28"/>
+        </w:rPr>
+        <w:t>/</w:t>
       </w:r>
     </w:p>
     <w:p>
@@ -8330,7 +9066,6 @@
           <w:sz w:val="28"/>
           <w:szCs w:val="28"/>
         </w:rPr>
-        <w:lastRenderedPageBreak/>
         <w:t>Registry stores images, which consist of:</w:t>
       </w:r>
     </w:p>
@@ -8685,8 +9420,22 @@
           <w:sz w:val="28"/>
           <w:szCs w:val="28"/>
         </w:rPr>
-        <w:t>~/.docker/config.json</w:t>
-      </w:r>
+        <w:t>~/.docker/</w:t>
+      </w:r>
+      <w:proofErr w:type="spellStart"/>
+      <w:r>
+        <w:rPr>
+          <w:rFonts w:asciiTheme="majorBidi" w:hAnsiTheme="majorBidi" w:cstheme="majorBidi"/>
+          <w:b/>
+          <w:bCs/>
+          <w:i/>
+          <w:iCs/>
+          <w:sz w:val="28"/>
+          <w:szCs w:val="28"/>
+        </w:rPr>
+        <w:t>config.json</w:t>
+      </w:r>
+      <w:proofErr w:type="spellEnd"/>
       <w:r>
         <w:rPr>
           <w:rFonts w:asciiTheme="majorBidi" w:hAnsiTheme="majorBidi" w:cstheme="majorBidi"/>
@@ -8701,7 +9450,16 @@
           <w:sz w:val="28"/>
           <w:szCs w:val="28"/>
         </w:rPr>
-        <w:t>r in a credential helper (more secure).</w:t>
+        <w:t xml:space="preserve">r in a </w:t>
+      </w:r>
+      <w:r>
+        <w:rPr>
+          <w:rFonts w:asciiTheme="majorBidi" w:hAnsiTheme="majorBidi" w:cstheme="majorBidi"/>
+          <w:sz w:val="28"/>
+          <w:szCs w:val="28"/>
+        </w:rPr>
+        <w:lastRenderedPageBreak/>
+        <w:t>credential helper (more secure).</w:t>
       </w:r>
       <w:r>
         <w:rPr>
@@ -8974,8 +9732,22 @@
           <w:sz w:val="28"/>
           <w:szCs w:val="28"/>
         </w:rPr>
-        <w:t>docker login --username myuser</w:t>
-      </w:r>
+        <w:t xml:space="preserve">docker login --username </w:t>
+      </w:r>
+      <w:proofErr w:type="spellStart"/>
+      <w:r>
+        <w:rPr>
+          <w:rFonts w:asciiTheme="majorBidi" w:hAnsiTheme="majorBidi" w:cstheme="majorBidi"/>
+          <w:b/>
+          <w:bCs/>
+          <w:i/>
+          <w:iCs/>
+          <w:sz w:val="28"/>
+          <w:szCs w:val="28"/>
+        </w:rPr>
+        <w:t>myuser</w:t>
+      </w:r>
+      <w:proofErr w:type="spellEnd"/>
     </w:p>
     <w:p>
       <w:pPr>
@@ -9048,8 +9820,48 @@
           <w:sz w:val="28"/>
           <w:szCs w:val="28"/>
         </w:rPr>
-        <w:t>docker login -u myuser -p mypassword</w:t>
-      </w:r>
+        <w:t xml:space="preserve">docker login -u </w:t>
+      </w:r>
+      <w:proofErr w:type="spellStart"/>
+      <w:r>
+        <w:rPr>
+          <w:rFonts w:asciiTheme="majorBidi" w:hAnsiTheme="majorBidi" w:cstheme="majorBidi"/>
+          <w:b/>
+          <w:bCs/>
+          <w:i/>
+          <w:iCs/>
+          <w:sz w:val="28"/>
+          <w:szCs w:val="28"/>
+        </w:rPr>
+        <w:t>myuser</w:t>
+      </w:r>
+      <w:proofErr w:type="spellEnd"/>
+      <w:r>
+        <w:rPr>
+          <w:rFonts w:asciiTheme="majorBidi" w:hAnsiTheme="majorBidi" w:cstheme="majorBidi"/>
+          <w:b/>
+          <w:bCs/>
+          <w:i/>
+          <w:iCs/>
+          <w:sz w:val="28"/>
+          <w:szCs w:val="28"/>
+        </w:rPr>
+        <w:t xml:space="preserve"> -p </w:t>
+      </w:r>
+      <w:proofErr w:type="spellStart"/>
+      <w:r>
+        <w:rPr>
+          <w:rFonts w:asciiTheme="majorBidi" w:hAnsiTheme="majorBidi" w:cstheme="majorBidi"/>
+          <w:b/>
+          <w:bCs/>
+          <w:i/>
+          <w:iCs/>
+          <w:sz w:val="28"/>
+          <w:szCs w:val="28"/>
+        </w:rPr>
+        <w:t>mypassword</w:t>
+      </w:r>
+      <w:proofErr w:type="spellEnd"/>
     </w:p>
     <w:p>
       <w:pPr>
@@ -9142,7 +9954,59 @@
           <w:sz w:val="28"/>
           <w:szCs w:val="28"/>
         </w:rPr>
-        <w:t xml:space="preserve">docker login -u myuser -p mypassword </w:t>
+        <w:t xml:space="preserve">docker login -u </w:t>
+      </w:r>
+      <w:proofErr w:type="spellStart"/>
+      <w:r>
+        <w:rPr>
+          <w:rFonts w:asciiTheme="majorBidi" w:hAnsiTheme="majorBidi" w:cstheme="majorBidi"/>
+          <w:b/>
+          <w:bCs/>
+          <w:i/>
+          <w:iCs/>
+          <w:sz w:val="28"/>
+          <w:szCs w:val="28"/>
+        </w:rPr>
+        <w:t>myuser</w:t>
+      </w:r>
+      <w:proofErr w:type="spellEnd"/>
+      <w:r>
+        <w:rPr>
+          <w:rFonts w:asciiTheme="majorBidi" w:hAnsiTheme="majorBidi" w:cstheme="majorBidi"/>
+          <w:b/>
+          <w:bCs/>
+          <w:i/>
+          <w:iCs/>
+          <w:sz w:val="28"/>
+          <w:szCs w:val="28"/>
+        </w:rPr>
+        <w:t xml:space="preserve"> -p </w:t>
+      </w:r>
+      <w:proofErr w:type="spellStart"/>
+      <w:r>
+        <w:rPr>
+          <w:rFonts w:asciiTheme="majorBidi" w:hAnsiTheme="majorBidi" w:cstheme="majorBidi"/>
+          <w:b/>
+          <w:bCs/>
+          <w:i/>
+          <w:iCs/>
+          <w:sz w:val="28"/>
+          <w:szCs w:val="28"/>
+        </w:rPr>
+        <w:t>mypassword</w:t>
+      </w:r>
+      <w:proofErr w:type="spellEnd"/>
+      <w:r>
+        <w:rPr>
+          <w:rFonts w:asciiTheme="majorBidi" w:hAnsiTheme="majorBidi" w:cstheme="majorBidi"/>
+          <w:b/>
+          <w:bCs/>
+          <w:i/>
+          <w:iCs/>
+          <w:sz w:val="28"/>
+          <w:szCs w:val="28"/>
+        </w:rPr>
+        <w:t xml:space="preserve"> </w:t>
       </w:r>
       <w:r>
         <w:rPr>
@@ -9196,7 +10060,25 @@
           <w:sz w:val="28"/>
           <w:szCs w:val="28"/>
         </w:rPr>
-        <w:t>process list (ps aux)</w:t>
+        <w:t>process list (</w:t>
+      </w:r>
+      <w:proofErr w:type="spellStart"/>
+      <w:r>
+        <w:rPr>
+          <w:rFonts w:asciiTheme="majorBidi" w:hAnsiTheme="majorBidi" w:cstheme="majorBidi"/>
+          <w:sz w:val="28"/>
+          <w:szCs w:val="28"/>
+        </w:rPr>
+        <w:t>ps</w:t>
+      </w:r>
+      <w:proofErr w:type="spellEnd"/>
+      <w:r>
+        <w:rPr>
+          <w:rFonts w:asciiTheme="majorBidi" w:hAnsiTheme="majorBidi" w:cstheme="majorBidi"/>
+          <w:sz w:val="28"/>
+          <w:szCs w:val="28"/>
+        </w:rPr>
+        <w:t xml:space="preserve"> aux)</w:t>
       </w:r>
     </w:p>
     <w:p>
@@ -9383,28 +10265,53 @@
           <w:sz w:val="28"/>
           <w:szCs w:val="28"/>
         </w:rPr>
-        <w:t>echo "$TOKEN" | docker login -u myuser --password-stdin</w:t>
-      </w:r>
-    </w:p>
-    <w:p>
-      <w:pPr>
-        <w:rPr>
-          <w:rFonts w:asciiTheme="majorBidi" w:hAnsiTheme="majorBidi" w:cstheme="majorBidi"/>
-          <w:b/>
-          <w:bCs/>
-          <w:sz w:val="28"/>
-          <w:szCs w:val="28"/>
-        </w:rPr>
-      </w:pPr>
-      <w:r>
-        <w:rPr>
-          <w:rFonts w:asciiTheme="majorBidi" w:hAnsiTheme="majorBidi" w:cstheme="majorBidi"/>
-          <w:b/>
-          <w:bCs/>
-          <w:sz w:val="28"/>
-          <w:szCs w:val="28"/>
-        </w:rPr>
-        <w:lastRenderedPageBreak/>
+        <w:t xml:space="preserve">echo "$TOKEN" | docker login -u </w:t>
+      </w:r>
+      <w:proofErr w:type="spellStart"/>
+      <w:r>
+        <w:rPr>
+          <w:rFonts w:asciiTheme="majorBidi" w:hAnsiTheme="majorBidi" w:cstheme="majorBidi"/>
+          <w:b/>
+          <w:bCs/>
+          <w:i/>
+          <w:iCs/>
+          <w:sz w:val="28"/>
+          <w:szCs w:val="28"/>
+        </w:rPr>
+        <w:t>myuser</w:t>
+      </w:r>
+      <w:proofErr w:type="spellEnd"/>
+      <w:r>
+        <w:rPr>
+          <w:rFonts w:asciiTheme="majorBidi" w:hAnsiTheme="majorBidi" w:cstheme="majorBidi"/>
+          <w:b/>
+          <w:bCs/>
+          <w:i/>
+          <w:iCs/>
+          <w:sz w:val="28"/>
+          <w:szCs w:val="28"/>
+        </w:rPr>
+        <w:t xml:space="preserve"> --password-stdin</w:t>
+      </w:r>
+    </w:p>
+    <w:p>
+      <w:pPr>
+        <w:rPr>
+          <w:rFonts w:asciiTheme="majorBidi" w:hAnsiTheme="majorBidi" w:cstheme="majorBidi"/>
+          <w:b/>
+          <w:bCs/>
+          <w:sz w:val="28"/>
+          <w:szCs w:val="28"/>
+        </w:rPr>
+      </w:pPr>
+      <w:r>
+        <w:rPr>
+          <w:rFonts w:asciiTheme="majorBidi" w:hAnsiTheme="majorBidi" w:cstheme="majorBidi"/>
+          <w:b/>
+          <w:bCs/>
+          <w:sz w:val="28"/>
+          <w:szCs w:val="28"/>
+        </w:rPr>
         <w:t>Where credentials are stored</w:t>
       </w:r>
       <w:r>
@@ -9448,8 +10355,18 @@
           <w:sz w:val="28"/>
           <w:szCs w:val="28"/>
         </w:rPr>
-        <w:t>~/.docker/config.json</w:t>
-      </w:r>
+        <w:t>~/.docker/</w:t>
+      </w:r>
+      <w:proofErr w:type="spellStart"/>
+      <w:r>
+        <w:rPr>
+          <w:rFonts w:asciiTheme="majorBidi" w:hAnsiTheme="majorBidi" w:cstheme="majorBidi"/>
+          <w:sz w:val="28"/>
+          <w:szCs w:val="28"/>
+        </w:rPr>
+        <w:t>config.json</w:t>
+      </w:r>
+      <w:proofErr w:type="spellEnd"/>
     </w:p>
     <w:p>
       <w:pPr>
@@ -9562,7 +10479,25 @@
                                 <w:sz w:val="28"/>
                                 <w:szCs w:val="28"/>
                               </w:rPr>
-                              <w:t>"auths": {</w:t>
+                              <w:t>"</w:t>
+                            </w:r>
+                            <w:proofErr w:type="spellStart"/>
+                            <w:r>
+                              <w:rPr>
+                                <w:rFonts w:asciiTheme="majorBidi" w:hAnsiTheme="majorBidi" w:cstheme="majorBidi"/>
+                                <w:sz w:val="28"/>
+                                <w:szCs w:val="28"/>
+                              </w:rPr>
+                              <w:t>auths</w:t>
+                            </w:r>
+                            <w:proofErr w:type="spellEnd"/>
+                            <w:r>
+                              <w:rPr>
+                                <w:rFonts w:asciiTheme="majorBidi" w:hAnsiTheme="majorBidi" w:cstheme="majorBidi"/>
+                                <w:sz w:val="28"/>
+                                <w:szCs w:val="28"/>
+                              </w:rPr>
+                              <w:t>": {</w:t>
                             </w:r>
                           </w:p>
                           <w:p>
@@ -9799,7 +10734,25 @@
                           <w:sz w:val="28"/>
                           <w:szCs w:val="28"/>
                         </w:rPr>
-                        <w:t>"auths": {</w:t>
+                        <w:t>"</w:t>
+                      </w:r>
+                      <w:proofErr w:type="spellStart"/>
+                      <w:r>
+                        <w:rPr>
+                          <w:rFonts w:asciiTheme="majorBidi" w:hAnsiTheme="majorBidi" w:cstheme="majorBidi"/>
+                          <w:sz w:val="28"/>
+                          <w:szCs w:val="28"/>
+                        </w:rPr>
+                        <w:t>auths</w:t>
+                      </w:r>
+                      <w:proofErr w:type="spellEnd"/>
+                      <w:r>
+                        <w:rPr>
+                          <w:rFonts w:asciiTheme="majorBidi" w:hAnsiTheme="majorBidi" w:cstheme="majorBidi"/>
+                          <w:sz w:val="28"/>
+                          <w:szCs w:val="28"/>
+                        </w:rPr>
+                        <w:t>": {</w:t>
                       </w:r>
                     </w:p>
                     <w:p>
@@ -10209,6 +11162,7 @@
           <w:sz w:val="28"/>
           <w:szCs w:val="28"/>
         </w:rPr>
+        <w:lastRenderedPageBreak/>
         <w:t>pulling private images</w:t>
       </w:r>
     </w:p>
@@ -10409,7 +11363,25 @@
           <w:sz w:val="28"/>
           <w:szCs w:val="28"/>
         </w:rPr>
-        <w:t xml:space="preserve"> → specify architecture. Example: docker pull --platform linux/amd64 nginx</w:t>
+        <w:t xml:space="preserve"> → specify architecture. Example: docker pull --platform </w:t>
+      </w:r>
+      <w:proofErr w:type="spellStart"/>
+      <w:r>
+        <w:rPr>
+          <w:rFonts w:asciiTheme="majorBidi" w:hAnsiTheme="majorBidi" w:cstheme="majorBidi"/>
+          <w:sz w:val="28"/>
+          <w:szCs w:val="28"/>
+        </w:rPr>
+        <w:t>linux</w:t>
+      </w:r>
+      <w:proofErr w:type="spellEnd"/>
+      <w:r>
+        <w:rPr>
+          <w:rFonts w:asciiTheme="majorBidi" w:hAnsiTheme="majorBidi" w:cstheme="majorBidi"/>
+          <w:sz w:val="28"/>
+          <w:szCs w:val="28"/>
+        </w:rPr>
+        <w:t>/amd64 nginx</w:t>
       </w:r>
     </w:p>
     <w:p>
@@ -10448,7 +11420,7 @@
       </w:r>
     </w:p>
     <w:sectPr>
-      <w:pgSz w:w="12240" w:h="15840"/>
+      <w:pgSz w:w="11906" w:h="16838" w:code="9"/>
       <w:pgMar w:top="720" w:right="720" w:bottom="720" w:left="720" w:header="720" w:footer="720" w:gutter="0"/>
       <w:cols w:space="720"/>
       <w:docGrid w:linePitch="360"/>
@@ -10458,7 +11430,7 @@
 </file>
 
 <file path=word/numbering.xml><?xml version="1.0" encoding="utf-8"?>
-<w:numbering xmlns:wpc="http://schemas.microsoft.com/office/word/2010/wordprocessingCanvas" xmlns:cx="http://schemas.microsoft.com/office/drawing/2014/chartex" xmlns:cx1="http://schemas.microsoft.com/office/drawing/2015/9/8/chartex" xmlns:cx2="http://schemas.microsoft.com/office/drawing/2015/10/21/chartex" xmlns:cx3="http://schemas.microsoft.com/office/drawing/2016/5/9/chartex" xmlns:cx4="http://schemas.microsoft.com/office/drawing/2016/5/10/chartex" xmlns:cx5="http://schemas.microsoft.com/office/drawing/2016/5/11/chartex" xmlns:cx6="http://schemas.microsoft.com/office/drawing/2016/5/12/chartex" xmlns:cx7="http://schemas.microsoft.com/office/drawing/2016/5/13/chartex" xmlns:cx8="http://schemas.microsoft.com/office/drawing/2016/5/14/chartex" xmlns:mc="http://schemas.openxmlformats.org/markup-compatibility/2006" xmlns:aink="http://schemas.microsoft.com/office/drawing/2016/ink" xmlns:am3d="http://schemas.microsoft.com/office/drawing/2017/model3d" xmlns:o="urn:schemas-microsoft-com:office:office" xmlns:oel="http://schemas.microsoft.com/office/2019/extlst" xmlns:r="http://schemas.openxmlformats.org/officeDocument/2006/relationships" xmlns:m="http://schemas.openxmlformats.org/officeDocument/2006/math" xmlns:v="urn:schemas-microsoft-com:vml" xmlns:wp14="http://schemas.microsoft.com/office/word/2010/wordprocessingDrawing" xmlns:wp="http://schemas.openxmlformats.org/drawingml/2006/wordprocessingDrawing" xmlns:w10="urn:schemas-microsoft-com:office:word" xmlns:w="http://schemas.openxmlformats.org/wordprocessingml/2006/main" xmlns:w14="http://schemas.microsoft.com/office/word/2010/wordml" xmlns:w15="http://schemas.microsoft.com/office/word/2012/wordml" xmlns:w16cex="http://schemas.microsoft.com/office/word/2018/wordml/cex" xmlns:w16cid="http://schemas.microsoft.com/office/word/2016/wordml/cid" xmlns:w16="http://schemas.microsoft.com/office/word/2018/wordml" xmlns:w16du="http://schemas.microsoft.com/office/word/2023/wordml/word16du" xmlns:w16sdtdh="http://schemas.microsoft.com/office/word/2020/wordml/sdtdatahash" xmlns:w16sdtfl="http://schemas.microsoft.com/office/word/2024/wordml/sdtformatlock" xmlns:w16se="http://schemas.microsoft.com/office/word/2015/wordml/symex" xmlns:wpg="http://schemas.microsoft.com/office/word/2010/wordprocessingGroup" xmlns:wpi="http://schemas.microsoft.com/office/word/2010/wordprocessingInk" xmlns:wne="http://schemas.microsoft.com/office/word/2006/wordml" xmlns:wps="http://schemas.microsoft.com/office/word/2010/wordprocessingShape" mc:Ignorable="w14 w15 w16se w16cid w16 w16cex w16sdtdh w16sdtfl w16du wp14">
+<w:numbering xmlns:wpc="http://schemas.microsoft.com/office/word/2010/wordprocessingCanvas" xmlns:cx="http://schemas.microsoft.com/office/drawing/2014/chartex" xmlns:cx1="http://schemas.microsoft.com/office/drawing/2015/9/8/chartex" xmlns:cx2="http://schemas.microsoft.com/office/drawing/2015/10/21/chartex" xmlns:cx3="http://schemas.microsoft.com/office/drawing/2016/5/9/chartex" xmlns:cx4="http://schemas.microsoft.com/office/drawing/2016/5/10/chartex" xmlns:cx5="http://schemas.microsoft.com/office/drawing/2016/5/11/chartex" xmlns:cx6="http://schemas.microsoft.com/office/drawing/2016/5/12/chartex" xmlns:cx7="http://schemas.microsoft.com/office/drawing/2016/5/13/chartex" xmlns:cx8="http://schemas.microsoft.com/office/drawing/2016/5/14/chartex" xmlns:mc="http://schemas.openxmlformats.org/markup-compatibility/2006" xmlns:aink="http://schemas.microsoft.com/office/drawing/2016/ink" xmlns:am3d="http://schemas.microsoft.com/office/drawing/2017/model3d" xmlns:o="urn:schemas-microsoft-com:office:office" xmlns:oel="http://schemas.microsoft.com/office/2019/extlst" xmlns:r="http://schemas.openxmlformats.org/officeDocument/2006/relationships" xmlns:m="http://schemas.openxmlformats.org/officeDocument/2006/math" xmlns:v="urn:schemas-microsoft-com:vml" xmlns:wp14="http://schemas.microsoft.com/office/word/2010/wordprocessingDrawing" xmlns:wp="http://schemas.openxmlformats.org/drawingml/2006/wordprocessingDrawing" xmlns:w10="urn:schemas-microsoft-com:office:word" xmlns:w="http://schemas.openxmlformats.org/wordprocessingml/2006/main" xmlns:w14="http://schemas.microsoft.com/office/word/2010/wordml" xmlns:w15="http://schemas.microsoft.com/office/word/2012/wordml" xmlns:w16cex="http://schemas.microsoft.com/office/word/2018/wordml/cex" xmlns:w16cid="http://schemas.microsoft.com/office/word/2016/wordml/cid" xmlns:w16="http://schemas.microsoft.com/office/word/2018/wordml" xmlns:w16sdtdh="http://schemas.microsoft.com/office/word/2020/wordml/sdtdatahash" xmlns:w16se="http://schemas.microsoft.com/office/word/2015/wordml/symex" xmlns:wpg="http://schemas.microsoft.com/office/word/2010/wordprocessingGroup" xmlns:wpi="http://schemas.microsoft.com/office/word/2010/wordprocessingInk" xmlns:wne="http://schemas.microsoft.com/office/word/2006/wordml" xmlns:wps="http://schemas.microsoft.com/office/word/2010/wordprocessingShape" mc:Ignorable="w14 w15 w16se w16cid w16 w16cex w16sdtdh wp14">
   <w:abstractNum w:abstractNumId="0" w15:restartNumberingAfterBreak="0">
     <w:nsid w:val="09911FDD"/>
     <w:multiLevelType w:val="hybridMultilevel"/>
@@ -14012,7 +14984,7 @@
 </file>
 
 <file path=word/styles.xml><?xml version="1.0" encoding="utf-8"?>
-<w:styles xmlns:mc="http://schemas.openxmlformats.org/markup-compatibility/2006" xmlns:r="http://schemas.openxmlformats.org/officeDocument/2006/relationships" xmlns:w="http://schemas.openxmlformats.org/wordprocessingml/2006/main" xmlns:w14="http://schemas.microsoft.com/office/word/2010/wordml" xmlns:w15="http://schemas.microsoft.com/office/word/2012/wordml" xmlns:w16cex="http://schemas.microsoft.com/office/word/2018/wordml/cex" xmlns:w16cid="http://schemas.microsoft.com/office/word/2016/wordml/cid" xmlns:w16="http://schemas.microsoft.com/office/word/2018/wordml" xmlns:w16du="http://schemas.microsoft.com/office/word/2023/wordml/word16du" xmlns:w16sdtdh="http://schemas.microsoft.com/office/word/2020/wordml/sdtdatahash" xmlns:w16sdtfl="http://schemas.microsoft.com/office/word/2024/wordml/sdtformatlock" xmlns:w16se="http://schemas.microsoft.com/office/word/2015/wordml/symex" mc:Ignorable="w14 w15 w16se w16cid w16 w16cex w16sdtdh w16sdtfl w16du">
+<w:styles xmlns:mc="http://schemas.openxmlformats.org/markup-compatibility/2006" xmlns:r="http://schemas.openxmlformats.org/officeDocument/2006/relationships" xmlns:w="http://schemas.openxmlformats.org/wordprocessingml/2006/main" xmlns:w14="http://schemas.microsoft.com/office/word/2010/wordml" xmlns:w15="http://schemas.microsoft.com/office/word/2012/wordml" xmlns:w16cex="http://schemas.microsoft.com/office/word/2018/wordml/cex" xmlns:w16cid="http://schemas.microsoft.com/office/word/2016/wordml/cid" xmlns:w16="http://schemas.microsoft.com/office/word/2018/wordml" xmlns:w16sdtdh="http://schemas.microsoft.com/office/word/2020/wordml/sdtdatahash" xmlns:w16se="http://schemas.microsoft.com/office/word/2015/wordml/symex" mc:Ignorable="w14 w15 w16se w16cid w16 w16cex w16sdtdh">
   <w:docDefaults>
     <w:rPrDefault>
       <w:rPr>

</xml_diff>